<commit_message>
README con el isotipo, la apertura y el recorrido animados; manuales, notas técnicas y decisiones de la versión 3
- README en español e inglés: isotipo de VicMar, sección de identidad visual, GIF de la apertura y del recorrido, capturas nuevas.
- Manual de usuario reescrito para los tres roles y las pantallas actuales; manuales regenerados en Word.
- ADR-005 y DT-05 con la comparación real de los cuatro modelos (LightGBM elegido por validación cruzada).
- Verificador de coherencia del Avance 2 apuntando a los artefactos actuales.
- Retiro de archivos y referencias del enfoque anterior.
</commit_message>
<xml_diff>
--- a/documentacion/manuales/MANUAL_TECNICO_DE_INSTALACION.docx
+++ b/documentacion/manuales/MANUAL_TECNICO_DE_INSTALACION.docx
@@ -10,7 +10,7 @@
       <w:r>
         <w:drawing>
           <wp:inline xmlns:a="http://schemas.openxmlformats.org/drawingml/2006/main" xmlns:pic="http://schemas.openxmlformats.org/drawingml/2006/picture">
-            <wp:extent cx="1512000" cy="1462125"/>
+            <wp:extent cx="1224000" cy="1224000"/>
             <wp:docPr id="1" name="Picture 1"/>
             <wp:cNvGraphicFramePr>
               <a:graphicFrameLocks noChangeAspect="1"/>
@@ -19,7 +19,7 @@
               <a:graphicData uri="http://schemas.openxmlformats.org/drawingml/2006/picture">
                 <pic:pic>
                   <pic:nvPicPr>
-                    <pic:cNvPr id="0" name="logo.png"/>
+                    <pic:cNvPr id="0" name="logo-vicmar.png"/>
                     <pic:cNvPicPr/>
                   </pic:nvPicPr>
                   <pic:blipFill>
@@ -31,7 +31,7 @@
                   <pic:spPr>
                     <a:xfrm>
                       <a:off x="0" y="0"/>
-                      <a:ext cx="1512000" cy="1462125"/>
+                      <a:ext cx="1224000" cy="1224000"/>
                     </a:xfrm>
                     <a:prstGeom prst="rect"/>
                   </pic:spPr>
@@ -105,7 +105,7 @@
           <w:color w:val="FF6900"/>
           <w:sz w:val="36"/>
         </w:rPr>
-        <w:t>VicMar Data AI</w:t>
+        <w:t>VicMar</w:t>
       </w:r>
     </w:p>
     <w:p>
@@ -117,9 +117,9 @@
           <w:color w:val="5B7385"/>
           <w:sz w:val="24"/>
         </w:rPr>
-        <w:t>Predicción del abandono estudiantil con inteligencia de negocios</w:t>
+        <w:t>Alerta temprana del abandono en estudiantes universitarios</w:t>
         <w:br/>
-        <w:t>y consultas en lenguaje natural</w:t>
+        <w:t>con aprendizaje automático y consulta conversacional</w:t>
       </w:r>
     </w:p>
     <w:p>
@@ -163,7 +163,7 @@
           <w:color w:val="5B7385"/>
           <w:sz w:val="20"/>
         </w:rPr>
-        <w:t>1.0 · octubre de 2026 · Milagro, Ecuador</w:t>
+        <w:t>3.0 · octubre de 2026 (corresponde a la versión 3 del prototipo) · Milagro, Ecuador</w:t>
       </w:r>
     </w:p>
     <w:p>
@@ -209,17 +209,19 @@
       </w:r>
       <w:r>
         <w:rPr/>
-        <w:t xml:space="preserve">el personal de TI que recibe el sistema y debe instalarlo, configurarlo y verificarlo en una computadora con Windows 10 u 11. No hace falta conocer el código. Siga los pasos en orden; los comandos se escriben en </w:t>
+        <w:t xml:space="preserve"> el personal de TI que instala, configura y verifica el sistema en una computadora con Windows 10 u 11. No hace falta conocer el código. Los comandos se escriben en una consola (</w:t>
       </w:r>
       <w:r>
         <w:rPr>
-          <w:b/>
+          <w:rFonts w:ascii="Consolas" w:hAnsi="Consolas"/>
+          <w:color w:val="002E45"/>
+          <w:sz w:val="19"/>
         </w:rPr>
-        <w:t>PowerShell</w:t>
+        <w:t>cmd</w:t>
       </w:r>
       <w:r>
         <w:rPr/>
-        <w:t>, uno a la vez, desde la carpeta raíz del proyecto, salvo que el paso indique otra cosa.</w:t>
+        <w:t xml:space="preserve"> o PowerShell) desde la carpeta raíz del proyecto, salvo que el paso indique otra cosa.</w:t>
       </w:r>
     </w:p>
     <w:p>
@@ -227,7 +229,7 @@
         <w:pStyle w:val="Heading2"/>
       </w:pPr>
       <w:r>
-        <w:t>1. Las tres piezas del sistema</w:t>
+        <w:t>1. Las piezas del sistema</w:t>
       </w:r>
     </w:p>
     <w:tbl>
@@ -356,7 +358,7 @@
                 <w:b/>
                 <w:sz w:val="19"/>
               </w:rPr>
-              <w:t>Frontend</w:t>
+              <w:t>Aplicación web</w:t>
             </w:r>
           </w:p>
         </w:tc>
@@ -373,7 +375,7 @@
               <w:rPr>
                 <w:sz w:val="19"/>
               </w:rPr>
-              <w:t>La aplicación web (React + Vite) que usan las personas</w:t>
+              <w:t>React 18 + TypeScript + Vite; es lo que usan las personas</w:t>
             </w:r>
           </w:p>
         </w:tc>
@@ -432,7 +434,7 @@
                 <w:b/>
                 <w:sz w:val="19"/>
               </w:rPr>
-              <w:t>Backend</w:t>
+              <w:t>API</w:t>
             </w:r>
           </w:p>
         </w:tc>
@@ -450,7 +452,7 @@
               <w:rPr>
                 <w:sz w:val="19"/>
               </w:rPr>
-              <w:t>API FastAPI: modelo predictivo, consultas en lenguaje natural, seguridad</w:t>
+              <w:t>FastAPI: sesiones, panel, estudiantes, seguimiento, consulta conversacional, reportes y administración (27 servicios)</w:t>
             </w:r>
           </w:p>
         </w:tc>
@@ -510,7 +512,7 @@
                 <w:b/>
                 <w:sz w:val="19"/>
               </w:rPr>
-              <w:t>Base de datos</w:t>
+              <w:t>Procesos por lotes</w:t>
             </w:r>
           </w:p>
         </w:tc>
@@ -527,7 +529,21 @@
               <w:rPr>
                 <w:sz w:val="19"/>
               </w:rPr>
-              <w:t>SQL Server 2022 dentro de un contenedor Docker</w:t>
+              <w:t>Carga de datos, ETL, entrenamiento, calificación, segmentación y reportes (</w:t>
+            </w:r>
+            <w:r>
+              <w:rPr>
+                <w:rFonts w:ascii="Consolas" w:hAnsi="Consolas"/>
+                <w:color w:val="002E45"/>
+                <w:sz w:val="19"/>
+              </w:rPr>
+              <w:t>scripts/pipeline.py</w:t>
+            </w:r>
+            <w:r>
+              <w:rPr>
+                <w:sz w:val="19"/>
+              </w:rPr>
+              <w:t>)</w:t>
             </w:r>
           </w:p>
         </w:tc>
@@ -542,17 +558,11 @@
             <w:r/>
             <w:r>
               <w:rPr>
-                <w:sz w:val="19"/>
-              </w:rPr>
-              <w:t xml:space="preserve">contenedor </w:t>
-            </w:r>
-            <w:r>
-              <w:rPr>
                 <w:rFonts w:ascii="Consolas" w:hAnsi="Consolas"/>
                 <w:color w:val="002E45"/>
                 <w:sz w:val="19"/>
               </w:rPr>
-              <w:t>vicmar-sqlserver</w:t>
+              <w:t>codigo_fuente/backend/</w:t>
             </w:r>
           </w:p>
         </w:tc>
@@ -565,13 +575,116 @@
               <w:spacing w:after="0"/>
             </w:pPr>
             <w:r/>
+          </w:p>
+        </w:tc>
+      </w:tr>
+      <w:tr>
+        <w:tc>
+          <w:tcPr>
+            <w:tcW w:type="dxa" w:w="2351"/>
+            <w:shd w:val="clear" w:color="auto" w:fill="F2F6F9"/>
+          </w:tcPr>
+          <w:p>
+            <w:pPr>
+              <w:spacing w:after="0"/>
+            </w:pPr>
+            <w:r/>
+            <w:r>
+              <w:rPr>
+                <w:b/>
+                <w:sz w:val="19"/>
+              </w:rPr>
+              <w:t>Base de datos</w:t>
+            </w:r>
+          </w:p>
+        </w:tc>
+        <w:tc>
+          <w:tcPr>
+            <w:tcW w:type="dxa" w:w="2351"/>
+            <w:shd w:val="clear" w:color="auto" w:fill="F2F6F9"/>
+          </w:tcPr>
+          <w:p>
+            <w:pPr>
+              <w:spacing w:after="0"/>
+            </w:pPr>
+            <w:r/>
+            <w:r>
+              <w:rPr>
+                <w:sz w:val="19"/>
+              </w:rPr>
+              <w:t xml:space="preserve">SQL Server 2022 en el contenedor Docker </w:t>
+            </w:r>
             <w:r>
               <w:rPr>
                 <w:rFonts w:ascii="Consolas" w:hAnsi="Consolas"/>
                 <w:color w:val="002E45"/>
                 <w:sz w:val="19"/>
               </w:rPr>
+              <w:t>vicmar-sqlserver</w:t>
+            </w:r>
+          </w:p>
+        </w:tc>
+        <w:tc>
+          <w:tcPr>
+            <w:tcW w:type="dxa" w:w="2351"/>
+            <w:shd w:val="clear" w:color="auto" w:fill="F2F6F9"/>
+          </w:tcPr>
+          <w:p>
+            <w:pPr>
+              <w:spacing w:after="0"/>
+            </w:pPr>
+            <w:r/>
+            <w:r>
+              <w:rPr>
+                <w:sz w:val="19"/>
+              </w:rPr>
+              <w:t>Docker</w:t>
+            </w:r>
+          </w:p>
+        </w:tc>
+        <w:tc>
+          <w:tcPr>
+            <w:tcW w:type="dxa" w:w="2351"/>
+            <w:shd w:val="clear" w:color="auto" w:fill="F2F6F9"/>
+          </w:tcPr>
+          <w:p>
+            <w:pPr>
+              <w:spacing w:after="0"/>
+            </w:pPr>
+            <w:r/>
+            <w:r>
+              <w:rPr>
+                <w:sz w:val="19"/>
+              </w:rPr>
+              <w:t xml:space="preserve">según </w:t>
+            </w:r>
+            <w:r>
+              <w:rPr>
+                <w:rFonts w:ascii="Consolas" w:hAnsi="Consolas"/>
+                <w:color w:val="002E45"/>
+                <w:sz w:val="19"/>
+              </w:rPr>
+              <w:t>DB_HOST</w:t>
+            </w:r>
+            <w:r>
+              <w:rPr>
+                <w:sz w:val="19"/>
+              </w:rPr>
+              <w:t xml:space="preserve"> (por defecto </w:t>
+            </w:r>
+            <w:r>
+              <w:rPr>
+                <w:rFonts w:ascii="Consolas" w:hAnsi="Consolas"/>
+                <w:color w:val="002E45"/>
+                <w:sz w:val="19"/>
+              </w:rPr>
               <w:t>1433</w:t>
+            </w:r>
+            <w:r>
+              <w:rPr>
+                <w:sz w:val="19"/>
+              </w:rPr>
+              <w:t>)</w:t>
             </w:r>
           </w:p>
         </w:tc>
@@ -581,12 +694,6 @@
       <w:pPr>
         <w:spacing w:after="40"/>
       </w:pPr>
-    </w:p>
-    <w:p>
-      <w:r>
-        <w:rPr/>
-        <w:t>Las tres deben estar encendidas al mismo tiempo: la aplicación web habla con el backend y el backend con la base de datos.</w:t>
-      </w:r>
     </w:p>
     <w:p>
       <w:pPr>
@@ -598,9 +705,53 @@
           <w:rFonts w:ascii="Consolas" w:hAnsi="Consolas"/>
           <w:sz w:val="17"/>
         </w:rPr>
-        <w:t xml:space="preserve"> Navegador ──▶ Frontend :3000 ──/api──▶ Backend :8090 ──▶ SQL Server :1433 (Docker)</w:t>
+        <w:t xml:space="preserve"> Navegador ──▶ Aplicación web :3000 ──/api──▶ API :8090 ──chat_reader / app_seguimiento──▶ SQL Server (Docker)</w:t>
         <w:br/>
-        <w:t xml:space="preserve">                                            └──▶ Proveedores de IA (Gemini → Groq → NVIDIA NIM)</w:t>
+        <w:t xml:space="preserve">                                                 └──▶ Proveedores de IA (Gemini → Groq → NVIDIA NIM → DeepSeek)</w:t>
+        <w:br/>
+        <w:t xml:space="preserve"> Procesos por lotes ──cuenta de administración──▶ SQL Server</w:t>
+      </w:r>
+    </w:p>
+    <w:p>
+      <w:r>
+        <w:rPr/>
+        <w:t xml:space="preserve">La API nunca usa la cuenta de administración: lee con </w:t>
+      </w:r>
+      <w:r>
+        <w:rPr>
+          <w:rFonts w:ascii="Consolas" w:hAnsi="Consolas"/>
+          <w:color w:val="002E45"/>
+          <w:sz w:val="19"/>
+        </w:rPr>
+        <w:t>chat_reader</w:t>
+      </w:r>
+      <w:r>
+        <w:rPr/>
+        <w:t xml:space="preserve"> (solo vistas </w:t>
+      </w:r>
+      <w:r>
+        <w:rPr>
+          <w:rFonts w:ascii="Consolas" w:hAnsi="Consolas"/>
+          <w:color w:val="002E45"/>
+          <w:sz w:val="19"/>
+        </w:rPr>
+        <w:t>VIS_*</w:t>
+      </w:r>
+      <w:r>
+        <w:rPr/>
+        <w:t xml:space="preserve">) y registra el seguimiento con </w:t>
+      </w:r>
+      <w:r>
+        <w:rPr>
+          <w:rFonts w:ascii="Consolas" w:hAnsi="Consolas"/>
+          <w:color w:val="002E45"/>
+          <w:sz w:val="19"/>
+        </w:rPr>
+        <w:t>app_seguimiento</w:t>
+      </w:r>
+      <w:r>
+        <w:rPr/>
+        <w:t xml:space="preserve"> (solo dos procedimientos).</w:t>
       </w:r>
     </w:p>
     <w:p>
@@ -786,12 +937,6 @@
             <w:r/>
             <w:r>
               <w:rPr>
-                <w:sz w:val="19"/>
-              </w:rPr>
-              <w:t xml:space="preserve">Abrirlo y esperar a que el ícono de la ballena quede quieto; </w:t>
-            </w:r>
-            <w:r>
-              <w:rPr>
                 <w:rFonts w:ascii="Consolas" w:hAnsi="Consolas"/>
                 <w:color w:val="002E45"/>
                 <w:sz w:val="19"/>
@@ -835,13 +980,13 @@
                 <w:b/>
                 <w:sz w:val="19"/>
               </w:rPr>
-              <w:t>Node.js 22 LTS</w:t>
-            </w:r>
-            <w:r>
-              <w:rPr>
-                <w:sz w:val="19"/>
-              </w:rPr>
-              <w:t xml:space="preserve"> o superior</w:t>
+              <w:t>Python 3.14</w:t>
+            </w:r>
+            <w:r>
+              <w:rPr>
+                <w:sz w:val="19"/>
+              </w:rPr>
+              <w:t xml:space="preserve"> (o 3.13), con «Add python.exe to PATH»</w:t>
             </w:r>
           </w:p>
         </w:tc>
@@ -859,7 +1004,7 @@
               <w:rPr>
                 <w:sz w:val="19"/>
               </w:rPr>
-              <w:t>https://nodejs.org/</w:t>
+              <w:t>https://www.python.org/downloads/</w:t>
             </w:r>
           </w:p>
         </w:tc>
@@ -879,7 +1024,7 @@
                 <w:color w:val="002E45"/>
                 <w:sz w:val="19"/>
               </w:rPr>
-              <w:t>node --version</w:t>
+              <w:t>py -3.14 --version</w:t>
             </w:r>
           </w:p>
         </w:tc>
@@ -916,13 +1061,13 @@
                 <w:b/>
                 <w:sz w:val="19"/>
               </w:rPr>
-              <w:t>Python 3.14</w:t>
-            </w:r>
-            <w:r>
-              <w:rPr>
-                <w:sz w:val="19"/>
-              </w:rPr>
-              <w:t xml:space="preserve"> (marcar «Add python.exe to PATH»)</w:t>
+              <w:t>Node.js 20</w:t>
+            </w:r>
+            <w:r>
+              <w:rPr>
+                <w:sz w:val="19"/>
+              </w:rPr>
+              <w:t xml:space="preserve"> o superior</w:t>
             </w:r>
           </w:p>
         </w:tc>
@@ -939,7 +1084,7 @@
               <w:rPr>
                 <w:sz w:val="19"/>
               </w:rPr>
-              <w:t>https://www.python.org/downloads/</w:t>
+              <w:t>https://nodejs.org/</w:t>
             </w:r>
           </w:p>
         </w:tc>
@@ -958,7 +1103,7 @@
                 <w:color w:val="002E45"/>
                 <w:sz w:val="19"/>
               </w:rPr>
-              <w:t>py -3.14 --version</w:t>
+              <w:t>node --version</w:t>
             </w:r>
           </w:p>
         </w:tc>
@@ -1033,7 +1178,7 @@
               <w:rPr>
                 <w:sz w:val="19"/>
               </w:rPr>
-              <w:t>Aparece en «Orígenes de datos ODBC» de Windows</w:t>
+              <w:t>Aparece en «Orígenes de datos ODBC»</w:t>
             </w:r>
           </w:p>
         </w:tc>
@@ -1076,7 +1221,7 @@
               <w:rPr>
                 <w:sz w:val="19"/>
               </w:rPr>
-              <w:t xml:space="preserve"> (solo si se clona desde GitHub)</w:t>
+              <w:t xml:space="preserve"> (para clonar)</w:t>
             </w:r>
           </w:p>
         </w:tc>
@@ -1126,7 +1271,7 @@
     <w:p>
       <w:r>
         <w:rPr/>
-        <w:t>Hardware recomendado: 8 GB de RAM (SQL Server usa unos 2 GB) y 10 GB libres en disco.</w:t>
+        <w:t>Hardware recomendado: 8 GB de RAM (SQL Server usa unos 2 GB) y 10 GB libres en disco. El entrenamiento completo de las dos instituciones tarda alrededor de una hora en un equipo de escritorio.</w:t>
       </w:r>
     </w:p>
     <w:p>
@@ -1139,21 +1284,6 @@
     </w:p>
     <w:p>
       <w:pPr>
-        <w:pStyle w:val="ListBullet"/>
-      </w:pPr>
-      <w:r>
-        <w:rPr>
-          <w:b/>
-        </w:rPr>
-        <w:t>Desde GitHub</w:t>
-      </w:r>
-      <w:r>
-        <w:rPr/>
-        <w:t xml:space="preserve"> (repositorio privado; requiere permiso de acceso):</w:t>
-      </w:r>
-    </w:p>
-    <w:p>
-      <w:pPr>
         <w:shd w:val="clear" w:color="auto" w:fill="F2F4F6"/>
         <w:ind w:left="170"/>
       </w:pPr>
@@ -1162,24 +1292,15 @@
           <w:rFonts w:ascii="Consolas" w:hAnsi="Consolas"/>
           <w:sz w:val="17"/>
         </w:rPr>
-        <w:t xml:space="preserve">  git clone https://github.com/Vm199524/PROYECTO-TITULACION-MARLON-VICTOR-UNEMI.git</w:t>
+        <w:t>git clone https://github.com/Vm199524/PROYECTO-TITULACION-MARLON-VICTOR-UNEMI.git</w:t>
         <w:br/>
-        <w:t xml:space="preserve">  cd PROYECTO-TITULACION-MARLON-VICTOR-UNEMI</w:t>
+        <w:t>cd PROYECTO-TITULACION-MARLON-VICTOR-UNEMI</w:t>
       </w:r>
     </w:p>
     <w:p>
-      <w:pPr>
-        <w:pStyle w:val="ListBullet"/>
-      </w:pPr>
-      <w:r>
-        <w:rPr>
-          <w:b/>
-        </w:rPr>
-        <w:t>Desde una copia</w:t>
-      </w:r>
       <w:r>
         <w:rPr/>
-        <w:t xml:space="preserve"> (carpeta comprimida o memoria USB): copiar la carpeta del proyecto </w:t>
+        <w:t xml:space="preserve">Desde una copia: copie la carpeta </w:t>
       </w:r>
       <w:r>
         <w:rPr>
@@ -1213,7 +1334,7 @@
       </w:r>
       <w:r>
         <w:rPr/>
-        <w:t xml:space="preserve"> ni </w:t>
+        <w:t xml:space="preserve">, </w:t>
       </w:r>
       <w:r>
         <w:rPr>
@@ -1225,7 +1346,75 @@
       </w:r>
       <w:r>
         <w:rPr/>
-        <w:t>, que se regeneran en la computadora nueva.</w:t>
+        <w:t xml:space="preserve"> ni </w:t>
+      </w:r>
+      <w:r>
+        <w:rPr>
+          <w:rFonts w:ascii="Consolas" w:hAnsi="Consolas"/>
+          <w:color w:val="002E45"/>
+          <w:sz w:val="19"/>
+        </w:rPr>
+        <w:t>datos_locales/</w:t>
+      </w:r>
+      <w:r>
+        <w:rPr/>
+        <w:t>, que se regeneran.</w:t>
+      </w:r>
+    </w:p>
+    <w:p>
+      <w:r>
+        <w:rPr>
+          <w:b/>
+        </w:rPr>
+        <w:t>Datos reales opcionales (OULAD):</w:t>
+      </w:r>
+      <w:r>
+        <w:rPr/>
+        <w:t xml:space="preserve"> descargue el dataset de la Open University y descomprima sus CSV en </w:t>
+      </w:r>
+      <w:r>
+        <w:rPr>
+          <w:rFonts w:ascii="Consolas" w:hAnsi="Consolas"/>
+          <w:color w:val="002E45"/>
+          <w:sz w:val="19"/>
+        </w:rPr>
+        <w:t>datos\externos\oulad\</w:t>
+      </w:r>
+      <w:r>
+        <w:rPr/>
+        <w:t xml:space="preserve"> como indica </w:t>
+      </w:r>
+      <w:r>
+        <w:rPr/>
+        <w:t>`datos/README.md`</w:t>
+      </w:r>
+      <w:r>
+        <w:rPr/>
+        <w:t xml:space="preserve">. Sin esos archivos, el sistema funciona solo con </w:t>
+      </w:r>
+      <w:r>
+        <w:rPr>
+          <w:rFonts w:ascii="Consolas" w:hAnsi="Consolas"/>
+          <w:color w:val="002E45"/>
+          <w:sz w:val="19"/>
+        </w:rPr>
+        <w:t>UNEMI_PRUEBAS</w:t>
+      </w:r>
+      <w:r>
+        <w:rPr/>
+        <w:t xml:space="preserve"> usando la opción </w:t>
+      </w:r>
+      <w:r>
+        <w:rPr>
+          <w:rFonts w:ascii="Consolas" w:hAnsi="Consolas"/>
+          <w:color w:val="002E45"/>
+          <w:sz w:val="19"/>
+        </w:rPr>
+        <w:t>--sin-oulad</w:t>
+      </w:r>
+      <w:r>
+        <w:rPr/>
+        <w:t>.</w:t>
       </w:r>
     </w:p>
     <w:p>
@@ -1233,23 +1422,7 @@
         <w:pStyle w:val="Heading2"/>
       </w:pPr>
       <w:r>
-        <w:t>4. Configuración local</w:t>
-      </w:r>
-    </w:p>
-    <w:p>
-      <w:r>
-        <w:rPr/>
-        <w:t xml:space="preserve">Estos archivos guardan contraseñas y claves, por eso </w:t>
-      </w:r>
-      <w:r>
-        <w:rPr>
-          <w:b/>
-        </w:rPr>
-        <w:t>nunca se suben al repositorio</w:t>
-      </w:r>
-      <w:r>
-        <w:rPr/>
-        <w:t>. Se crean a partir de sus plantillas:</w:t>
+        <w:t>4. Configuración (`codigo_fuente\backend\.env`)</w:t>
       </w:r>
     </w:p>
     <w:p>
@@ -1264,21 +1437,13 @@
         </w:rPr>
         <w:t>copy codigo_fuente\backend\.env.example codigo_fuente\backend\.env</w:t>
         <w:br/>
-        <w:t>copy codigo_fuente\backend\usuarios_prueba.example.json codigo_fuente\backend\usuarios_prueba.local.json</w:t>
-      </w:r>
-    </w:p>
-    <w:p>
-      <w:pPr>
-        <w:pStyle w:val="Heading3"/>
-      </w:pPr>
-      <w:r>
-        <w:t>4.1 `codigo_fuente\backend\.env`</w:t>
+        <w:t>notepad codigo_fuente\backend\.env</w:t>
       </w:r>
     </w:p>
     <w:p>
       <w:r>
         <w:rPr/>
-        <w:t>Ábralo con el Bloc de notas. Cada variable está explicada dentro del archivo; estas son las imprescindibles:</w:t>
+        <w:t>El archivo nunca se sube al repositorio. Cada variable está explicada dentro de él; estas son las que importan:</w:t>
       </w:r>
     </w:p>
     <w:tbl>
@@ -1408,7 +1573,7 @@
               <w:rPr>
                 <w:sz w:val="19"/>
               </w:rPr>
-              <w:t xml:space="preserve"> (el contenedor de este manual)</w:t>
+              <w:t>, o el puerto que use el contenedor</w:t>
             </w:r>
           </w:p>
         </w:tc>
@@ -1487,7 +1652,7 @@
               <w:rPr>
                 <w:sz w:val="19"/>
               </w:rPr>
-              <w:t xml:space="preserve"> y la contraseña que se usará al crear el contenedor (paso 5)</w:t>
+              <w:t xml:space="preserve"> y la contraseña con la que se crea el contenedor (paso 5)</w:t>
             </w:r>
           </w:p>
         </w:tc>
@@ -1528,6 +1693,34 @@
               </w:rPr>
               <w:t>CHAT_READER_PASSWORD</w:t>
             </w:r>
+            <w:r>
+              <w:rPr>
+                <w:sz w:val="19"/>
+              </w:rPr>
+              <w:t xml:space="preserve">, </w:t>
+            </w:r>
+            <w:r>
+              <w:rPr>
+                <w:rFonts w:ascii="Consolas" w:hAnsi="Consolas"/>
+                <w:color w:val="002E45"/>
+                <w:sz w:val="19"/>
+              </w:rPr>
+              <w:t>APP_SEGUIMIENTO_PASSWORD</w:t>
+            </w:r>
+            <w:r>
+              <w:rPr>
+                <w:sz w:val="19"/>
+              </w:rPr>
+              <w:t xml:space="preserve">, </w:t>
+            </w:r>
+            <w:r>
+              <w:rPr>
+                <w:rFonts w:ascii="Consolas" w:hAnsi="Consolas"/>
+                <w:color w:val="002E45"/>
+                <w:sz w:val="19"/>
+              </w:rPr>
+              <w:t>JWT_SECRET_KEY</w:t>
+            </w:r>
           </w:p>
         </w:tc>
         <w:tc>
@@ -1543,20 +1736,21 @@
               <w:rPr>
                 <w:sz w:val="19"/>
               </w:rPr>
-              <w:t xml:space="preserve">Contraseña de la cuenta de </w:t>
-            </w:r>
-            <w:r>
-              <w:rPr>
-                <w:b/>
-                <w:sz w:val="19"/>
-              </w:rPr>
-              <w:t>solo lectura</w:t>
-            </w:r>
-            <w:r>
-              <w:rPr>
-                <w:sz w:val="19"/>
-              </w:rPr>
-              <w:t xml:space="preserve"> que ejecuta el SQL de la IA (la crea el pipeline)</w:t>
+              <w:t xml:space="preserve">Si quedan vacías, el pipeline las genera al azar y las escribe en el </w:t>
+            </w:r>
+            <w:r>
+              <w:rPr>
+                <w:rFonts w:ascii="Consolas" w:hAnsi="Consolas"/>
+                <w:color w:val="002E45"/>
+                <w:sz w:val="19"/>
+              </w:rPr>
+              <w:t>.env</w:t>
+            </w:r>
+            <w:r>
+              <w:rPr>
+                <w:sz w:val="19"/>
+              </w:rPr>
+              <w:t xml:space="preserve"> sin mostrarlas</w:t>
             </w:r>
           </w:p>
         </w:tc>
@@ -1573,7 +1767,7 @@
               <w:rPr>
                 <w:sz w:val="19"/>
               </w:rPr>
-              <w:t>Sí</w:t>
+              <w:t>No</w:t>
             </w:r>
           </w:p>
         </w:tc>
@@ -1625,6 +1819,20 @@
               </w:rPr>
               <w:t>NVIDIA_API_KEY</w:t>
             </w:r>
+            <w:r>
+              <w:rPr>
+                <w:sz w:val="19"/>
+              </w:rPr>
+              <w:t xml:space="preserve">, </w:t>
+            </w:r>
+            <w:r>
+              <w:rPr>
+                <w:rFonts w:ascii="Consolas" w:hAnsi="Consolas"/>
+                <w:color w:val="002E45"/>
+                <w:sz w:val="19"/>
+              </w:rPr>
+              <w:t>DEEPSEEK_API_KEY</w:t>
+            </w:r>
           </w:p>
         </w:tc>
         <w:tc>
@@ -1641,7 +1849,7 @@
               <w:rPr>
                 <w:sz w:val="19"/>
               </w:rPr>
-              <w:t>Al menos una clave gratuita de proveedor de IA</w:t>
+              <w:t>Al menos una clave para las preguntas fuera de las 40 métricas certificadas</w:t>
             </w:r>
           </w:p>
         </w:tc>
@@ -1659,7 +1867,7 @@
               <w:rPr>
                 <w:sz w:val="19"/>
               </w:rPr>
-              <w:t>Para el chat</w:t>
+              <w:t>Para la consulta generada con IA</w:t>
             </w:r>
           </w:p>
         </w:tc>
@@ -1680,7 +1888,7 @@
                 <w:color w:val="002E45"/>
                 <w:sz w:val="19"/>
               </w:rPr>
-              <w:t>JWT_SECRET_KEY</w:t>
+              <w:t>APP_ENV</w:t>
             </w:r>
           </w:p>
         </w:tc>
@@ -1695,123 +1903,37 @@
             <w:r/>
             <w:r>
               <w:rPr>
-                <w:sz w:val="19"/>
-              </w:rPr>
-              <w:t xml:space="preserve">Una cadena larga y aleatoria: </w:t>
-            </w:r>
-            <w:r>
-              <w:rPr>
                 <w:rFonts w:ascii="Consolas" w:hAnsi="Consolas"/>
                 <w:color w:val="002E45"/>
                 <w:sz w:val="19"/>
               </w:rPr>
-              <w:t>python -c "import secrets; print(secrets.token_urlsafe(64))"</w:t>
+              <w:t>development</w:t>
+            </w:r>
+            <w:r>
+              <w:rPr>
+                <w:sz w:val="19"/>
+              </w:rPr>
+              <w:t xml:space="preserve">; en </w:t>
+            </w:r>
+            <w:r>
+              <w:rPr>
+                <w:rFonts w:ascii="Consolas" w:hAnsi="Consolas"/>
+                <w:color w:val="002E45"/>
+                <w:sz w:val="19"/>
+              </w:rPr>
+              <w:t>production</w:t>
+            </w:r>
+            <w:r>
+              <w:rPr>
+                <w:sz w:val="19"/>
+              </w:rPr>
+              <w:t xml:space="preserve"> la API no arranca con la llave JWT de desarrollo</w:t>
             </w:r>
           </w:p>
         </w:tc>
         <w:tc>
           <w:tcPr>
             <w:tcW w:type="dxa" w:w="3135"/>
-          </w:tcPr>
-          <w:p>
-            <w:pPr>
-              <w:spacing w:after="0"/>
-            </w:pPr>
-            <w:r/>
-            <w:r>
-              <w:rPr>
-                <w:sz w:val="19"/>
-              </w:rPr>
-              <w:t>En producción</w:t>
-            </w:r>
-          </w:p>
-        </w:tc>
-      </w:tr>
-      <w:tr>
-        <w:tc>
-          <w:tcPr>
-            <w:tcW w:type="dxa" w:w="3135"/>
-            <w:shd w:val="clear" w:color="auto" w:fill="F2F6F9"/>
-          </w:tcPr>
-          <w:p>
-            <w:pPr>
-              <w:spacing w:after="0"/>
-            </w:pPr>
-            <w:r/>
-            <w:r>
-              <w:rPr>
-                <w:rFonts w:ascii="Consolas" w:hAnsi="Consolas"/>
-                <w:color w:val="002E45"/>
-                <w:sz w:val="19"/>
-              </w:rPr>
-              <w:t>FAL_KEY</w:t>
-            </w:r>
-            <w:r>
-              <w:rPr>
-                <w:sz w:val="19"/>
-              </w:rPr>
-              <w:t xml:space="preserve">, </w:t>
-            </w:r>
-            <w:r>
-              <w:rPr>
-                <w:rFonts w:ascii="Consolas" w:hAnsi="Consolas"/>
-                <w:color w:val="002E45"/>
-                <w:sz w:val="19"/>
-              </w:rPr>
-              <w:t>SMTP_*</w:t>
-            </w:r>
-            <w:r>
-              <w:rPr>
-                <w:sz w:val="19"/>
-              </w:rPr>
-              <w:t xml:space="preserve">, </w:t>
-            </w:r>
-            <w:r>
-              <w:rPr>
-                <w:rFonts w:ascii="Consolas" w:hAnsi="Consolas"/>
-                <w:color w:val="002E45"/>
-                <w:sz w:val="19"/>
-              </w:rPr>
-              <w:t>REDIS_*</w:t>
-            </w:r>
-            <w:r>
-              <w:rPr>
-                <w:sz w:val="19"/>
-              </w:rPr>
-              <w:t xml:space="preserve">, </w:t>
-            </w:r>
-            <w:r>
-              <w:rPr>
-                <w:rFonts w:ascii="Consolas" w:hAnsi="Consolas"/>
-                <w:color w:val="002E45"/>
-                <w:sz w:val="19"/>
-              </w:rPr>
-              <w:t>SENTRY_DSN</w:t>
-            </w:r>
-          </w:p>
-        </w:tc>
-        <w:tc>
-          <w:tcPr>
-            <w:tcW w:type="dxa" w:w="3135"/>
-            <w:shd w:val="clear" w:color="auto" w:fill="F2F6F9"/>
-          </w:tcPr>
-          <w:p>
-            <w:pPr>
-              <w:spacing w:after="0"/>
-            </w:pPr>
-            <w:r/>
-            <w:r>
-              <w:rPr>
-                <w:sz w:val="19"/>
-              </w:rPr>
-              <w:t>Lectura en voz alta, correo de recuperación, caché y monitoreo</w:t>
-            </w:r>
-          </w:p>
-        </w:tc>
-        <w:tc>
-          <w:tcPr>
-            <w:tcW w:type="dxa" w:w="3135"/>
-            <w:shd w:val="clear" w:color="auto" w:fill="F2F6F9"/>
           </w:tcPr>
           <w:p>
             <w:pPr>
@@ -1859,39 +1981,13 @@
       </w:r>
       <w:r>
         <w:rPr/>
-        <w:t xml:space="preserve"> debe cumplir la política de SQL Server: al menos 8 caracteres con mayúsculas, minúsculas, números y símbolos. Si no la cumple, el contenedor se detiene al arrancar.</w:t>
+        <w:t xml:space="preserve"> debe cumplir la política de SQL Server: 8 o más caracteres con mayúsculas, minúsculas, números y símbolos. Si no la cumple, el contenedor se detiene al arrancar.</w:t>
       </w:r>
     </w:p>
     <w:p>
       <w:r>
         <w:rPr/>
-        <w:t>Sin ninguna clave de IA el sistema funciona (paneles, métricas certificadas, administración); solo el chat responde con un aviso.</w:t>
-      </w:r>
-    </w:p>
-    <w:p>
-      <w:pPr>
-        <w:pStyle w:val="Heading3"/>
-      </w:pPr>
-      <w:r>
-        <w:t>4.2 `codigo_fuente\backend\usuarios_prueba.local.json`</w:t>
-      </w:r>
-    </w:p>
-    <w:p>
-      <w:r>
-        <w:rPr/>
-        <w:t xml:space="preserve">Contiene la contraseña de cada usuario de prueba, uno por rol. Reemplace cada </w:t>
-      </w:r>
-      <w:r>
-        <w:rPr>
-          <w:rFonts w:ascii="Consolas" w:hAnsi="Consolas"/>
-          <w:color w:val="002E45"/>
-          <w:sz w:val="19"/>
-        </w:rPr>
-        <w:t>CAMBIAR_POR_UNA_CONTRASEÑA</w:t>
-      </w:r>
-      <w:r>
-        <w:rPr/>
-        <w:t xml:space="preserve"> por una contraseña de 8 o más caracteres. Las contraseñas de la demostración se entregan aparte, nunca por el repositorio.</w:t>
+        <w:t>Sin ninguna clave de IA el sistema funciona completo: paneles, fichas, seguimiento, reportes y las 40 métricas certificadas de la consulta conversacional.</w:t>
       </w:r>
     </w:p>
     <w:p>
@@ -1899,42 +1995,7 @@
         <w:pStyle w:val="Heading2"/>
       </w:pPr>
       <w:r>
-        <w:t>5. Base de datos</w:t>
-      </w:r>
-    </w:p>
-    <w:p>
-      <w:pPr>
-        <w:pStyle w:val="Heading3"/>
-      </w:pPr>
-      <w:r>
-        <w:t>Opción A — Reconstruir todo con el pipeline (recomendada)</w:t>
-      </w:r>
-    </w:p>
-    <w:p>
-      <w:pPr>
-        <w:pStyle w:val="ListNumber"/>
-      </w:pPr>
-      <w:r>
-        <w:rPr>
-          <w:b/>
-        </w:rPr>
-        <w:t>Crear el contenedor</w:t>
-      </w:r>
-      <w:r>
-        <w:rPr/>
-        <w:t xml:space="preserve"> de SQL Server con la misma contraseña de </w:t>
-      </w:r>
-      <w:r>
-        <w:rPr>
-          <w:rFonts w:ascii="Consolas" w:hAnsi="Consolas"/>
-          <w:color w:val="002E45"/>
-          <w:sz w:val="19"/>
-        </w:rPr>
-        <w:t>DB_PASSWORD</w:t>
-      </w:r>
-      <w:r>
-        <w:rPr/>
-        <w:t>:</w:t>
+        <w:t>5. Crear el contenedor de SQL Server (una sola vez)</w:t>
       </w:r>
     </w:p>
     <w:p>
@@ -1947,7 +2008,11 @@
           <w:rFonts w:ascii="Consolas" w:hAnsi="Consolas"/>
           <w:sz w:val="17"/>
         </w:rPr>
-        <w:t xml:space="preserve">   docker run -d --name vicmar-sqlserver --restart unless-stopped -p 1433:1433 -e ACCEPT_EULA=Y -e MSSQL_PID=developer -e MSSQL_SA_PASSWORD="SU_CONTRASEÑA" mcr.microsoft.com/mssql/server:2022-latest</w:t>
+        <w:t>docker run -d --name vicmar-sqlserver --restart unless-stopped -p 1433:1433 ^</w:t>
+        <w:br/>
+        <w:t xml:space="preserve">  -e ACCEPT_EULA=Y -e MSSQL_PID=Developer -e "MSSQL_SA_PASSWORD=&lt;DB_PASSWORD&gt;" ^</w:t>
+        <w:br/>
+        <w:t xml:space="preserve">  mcr.microsoft.com/mssql/server:2022-latest</w:t>
       </w:r>
     </w:p>
     <w:p>
@@ -1977,7 +2042,7 @@
       </w:r>
       <w:r>
         <w:rPr/>
-        <w:t xml:space="preserve"> aparece con estado </w:t>
+        <w:t xml:space="preserve"> aparece en estado </w:t>
       </w:r>
       <w:r>
         <w:rPr>
@@ -1989,22 +2054,7 @@
       </w:r>
       <w:r>
         <w:rPr/>
-        <w:t>.</w:t>
-      </w:r>
-    </w:p>
-    <w:p>
-      <w:pPr>
-        <w:pStyle w:val="ListNumber"/>
-      </w:pPr>
-      <w:r>
-        <w:rPr>
-          <w:b/>
-        </w:rPr>
-        <w:t>Descargar el dataset público OULAD</w:t>
-      </w:r>
-      <w:r>
-        <w:rPr/>
-        <w:t xml:space="preserve"> en </w:t>
+        <w:t xml:space="preserve">. Si el puerto 1433 está ocupado, use por ejemplo </w:t>
       </w:r>
       <w:r>
         <w:rPr>
@@ -2012,15 +2062,19 @@
           <w:color w:val="002E45"/>
           <w:sz w:val="19"/>
         </w:rPr>
-        <w:t>datos\externos\oulad\</w:t>
+        <w:t>-p 14330:1433</w:t>
       </w:r>
       <w:r>
         <w:rPr/>
-        <w:t xml:space="preserve"> siguiendo </w:t>
+        <w:t xml:space="preserve"> y </w:t>
       </w:r>
       <w:r>
-        <w:rPr/>
-        <w:t>`datos/README.md`</w:t>
+        <w:rPr>
+          <w:rFonts w:ascii="Consolas" w:hAnsi="Consolas"/>
+          <w:color w:val="002E45"/>
+          <w:sz w:val="19"/>
+        </w:rPr>
+        <w:t>DB_HOST=localhost,14330</w:t>
       </w:r>
       <w:r>
         <w:rPr/>
@@ -2029,17 +2083,10 @@
     </w:p>
     <w:p>
       <w:pPr>
-        <w:pStyle w:val="ListNumber"/>
+        <w:pStyle w:val="Heading2"/>
       </w:pPr>
       <w:r>
-        <w:rPr>
-          <w:b/>
-        </w:rPr>
-        <w:t>Crear el entorno de Python</w:t>
-      </w:r>
-      <w:r>
-        <w:rPr/>
-        <w:t xml:space="preserve"> del backend:</w:t>
+        <w:t>6. Reconstruir el sistema</w:t>
       </w:r>
     </w:p>
     <w:p>
@@ -2052,39 +2099,37 @@
           <w:rFonts w:ascii="Consolas" w:hAnsi="Consolas"/>
           <w:sz w:val="17"/>
         </w:rPr>
-        <w:t xml:space="preserve">   py -3.14 -m venv codigo_fuente\backend\venv</w:t>
-        <w:br/>
-        <w:t xml:space="preserve">   codigo_fuente\backend\venv\Scripts\pip install -r codigo_fuente\backend\requirements.txt</w:t>
-      </w:r>
-    </w:p>
-    <w:p>
-      <w:pPr>
-        <w:pStyle w:val="ListNumber"/>
-      </w:pPr>
-      <w:r>
-        <w:rPr>
-          <w:b/>
-        </w:rPr>
-        <w:t>Ejecutar el pipeline completo:</w:t>
-      </w:r>
-    </w:p>
-    <w:p>
-      <w:pPr>
-        <w:shd w:val="clear" w:color="auto" w:fill="F2F4F6"/>
-        <w:ind w:left="170"/>
-      </w:pPr>
-      <w:r>
-        <w:rPr>
-          <w:rFonts w:ascii="Consolas" w:hAnsi="Consolas"/>
-          <w:sz w:val="17"/>
-        </w:rPr>
-        <w:t xml:space="preserve">   powershell -ExecutionPolicy Bypass -File codigo_fuente\scripts\demo_tesis.ps1</w:t>
+        <w:t>codigo_fuente\scripts\reconstruir_sistema.bat</w:t>
       </w:r>
     </w:p>
     <w:p>
       <w:r>
         <w:rPr/>
-        <w:t>El pipeline hace estos pasos en orden y se detiene si alguno falla:</w:t>
+        <w:t xml:space="preserve">El script crea el entorno virtual de Python, instala las dependencias fijadas, inicia Docker Desktop y el contenedor si están apagados y ejecuta el orquestador </w:t>
+      </w:r>
+      <w:r>
+        <w:rPr>
+          <w:rFonts w:ascii="Consolas" w:hAnsi="Consolas"/>
+          <w:color w:val="002E45"/>
+          <w:sz w:val="19"/>
+        </w:rPr>
+        <w:t>python -m scripts.pipeline</w:t>
+      </w:r>
+      <w:r>
+        <w:rPr/>
+        <w:t xml:space="preserve">, que registra cada paso en </w:t>
+      </w:r>
+      <w:r>
+        <w:rPr>
+          <w:rFonts w:ascii="Consolas" w:hAnsi="Consolas"/>
+          <w:color w:val="002E45"/>
+          <w:sz w:val="19"/>
+        </w:rPr>
+        <w:t>backend\datos_locales\</w:t>
+      </w:r>
+      <w:r>
+        <w:rPr/>
+        <w:t xml:space="preserve"> y se detiene en el primero que falle, indicando cómo retomarlo.</w:t>
       </w:r>
     </w:p>
     <w:tbl>
@@ -2202,9 +2247,11 @@
             <w:r/>
             <w:r>
               <w:rPr>
-                <w:sz w:val="19"/>
-              </w:rPr>
-              <w:t>Arranca el contenedor y espera a que SQL Server acepte conexiones</w:t>
+                <w:rFonts w:ascii="Consolas" w:hAnsi="Consolas"/>
+                <w:color w:val="002E45"/>
+                <w:sz w:val="19"/>
+              </w:rPr>
+              <w:t>entorno</w:t>
             </w:r>
           </w:p>
         </w:tc>
@@ -2221,7 +2268,21 @@
               <w:rPr>
                 <w:sz w:val="19"/>
               </w:rPr>
-              <w:t>Base de datos lista</w:t>
+              <w:t xml:space="preserve">Completa en el </w:t>
+            </w:r>
+            <w:r>
+              <w:rPr>
+                <w:rFonts w:ascii="Consolas" w:hAnsi="Consolas"/>
+                <w:color w:val="002E45"/>
+                <w:sz w:val="19"/>
+              </w:rPr>
+              <w:t>.env</w:t>
+            </w:r>
+            <w:r>
+              <w:rPr>
+                <w:sz w:val="19"/>
+              </w:rPr>
+              <w:t xml:space="preserve"> las variables de la versión 3 que falten</w:t>
             </w:r>
           </w:p>
         </w:tc>
@@ -2257,9 +2318,11 @@
             <w:r/>
             <w:r>
               <w:rPr>
-                <w:sz w:val="19"/>
-              </w:rPr>
-              <w:t>Anonimiza los datos de prueba</w:t>
+                <w:rFonts w:ascii="Consolas" w:hAnsi="Consolas"/>
+                <w:color w:val="002E45"/>
+                <w:sz w:val="19"/>
+              </w:rPr>
+              <w:t>conexion</w:t>
             </w:r>
           </w:p>
         </w:tc>
@@ -2277,7 +2340,7 @@
               <w:rPr>
                 <w:sz w:val="19"/>
               </w:rPr>
-              <w:t>Datos sin información personal real</w:t>
+              <w:t>Espera a que SQL Server acepte conexiones</w:t>
             </w:r>
           </w:p>
         </w:tc>
@@ -2311,23 +2374,11 @@
             <w:r/>
             <w:r>
               <w:rPr>
-                <w:sz w:val="19"/>
-              </w:rPr>
-              <w:t xml:space="preserve">Carga </w:t>
-            </w:r>
-            <w:r>
-              <w:rPr>
                 <w:rFonts w:ascii="Consolas" w:hAnsi="Consolas"/>
                 <w:color w:val="002E45"/>
                 <w:sz w:val="19"/>
               </w:rPr>
-              <w:t>UNEMI_PRUEBAS</w:t>
-            </w:r>
-            <w:r>
-              <w:rPr>
-                <w:sz w:val="19"/>
-              </w:rPr>
-              <w:t xml:space="preserve"> (alumnos e historial)</w:t>
+              <w:t>unemi</w:t>
             </w:r>
           </w:p>
         </w:tc>
@@ -2344,7 +2395,21 @@
               <w:rPr>
                 <w:sz w:val="19"/>
               </w:rPr>
-              <w:t>Primera institución</w:t>
+              <w:t xml:space="preserve">Base operativa </w:t>
+            </w:r>
+            <w:r>
+              <w:rPr>
+                <w:rFonts w:ascii="Consolas" w:hAnsi="Consolas"/>
+                <w:color w:val="002E45"/>
+                <w:sz w:val="19"/>
+              </w:rPr>
+              <w:t>UNEMI_PRUEBAS</w:t>
+            </w:r>
+            <w:r>
+              <w:rPr>
+                <w:sz w:val="19"/>
+              </w:rPr>
+              <w:t xml:space="preserve"> (sintética, semilla fija)</w:t>
             </w:r>
           </w:p>
         </w:tc>
@@ -2380,17 +2445,11 @@
             <w:r/>
             <w:r>
               <w:rPr>
-                <w:sz w:val="19"/>
-              </w:rPr>
-              <w:t xml:space="preserve">Carga </w:t>
-            </w:r>
-            <w:r>
-              <w:rPr>
                 <w:rFonts w:ascii="Consolas" w:hAnsi="Consolas"/>
                 <w:color w:val="002E45"/>
                 <w:sz w:val="19"/>
               </w:rPr>
-              <w:t>OULAD_PRUEBAS</w:t>
+              <w:t>oulad</w:t>
             </w:r>
           </w:p>
         </w:tc>
@@ -2408,7 +2467,21 @@
               <w:rPr>
                 <w:sz w:val="19"/>
               </w:rPr>
-              <w:t>Segunda institución, con datos reales anónimos</w:t>
+              <w:t xml:space="preserve">Base operativa </w:t>
+            </w:r>
+            <w:r>
+              <w:rPr>
+                <w:rFonts w:ascii="Consolas" w:hAnsi="Consolas"/>
+                <w:color w:val="002E45"/>
+                <w:sz w:val="19"/>
+              </w:rPr>
+              <w:t>OULAD_PRUEBAS</w:t>
+            </w:r>
+            <w:r>
+              <w:rPr>
+                <w:sz w:val="19"/>
+              </w:rPr>
+              <w:t xml:space="preserve"> en cortes de 28 días</w:t>
             </w:r>
           </w:p>
         </w:tc>
@@ -2442,17 +2515,11 @@
             <w:r/>
             <w:r>
               <w:rPr>
-                <w:sz w:val="19"/>
-              </w:rPr>
-              <w:t xml:space="preserve">Ejecuta </w:t>
-            </w:r>
-            <w:r>
-              <w:rPr>
                 <w:rFonts w:ascii="Consolas" w:hAnsi="Consolas"/>
                 <w:color w:val="002E45"/>
                 <w:sz w:val="19"/>
               </w:rPr>
-              <w:t>crear_chat_academico.sql</w:t>
+              <w:t>esquema</w:t>
             </w:r>
           </w:p>
         </w:tc>
@@ -2477,7 +2544,7 @@
                 <w:color w:val="002E45"/>
                 <w:sz w:val="19"/>
               </w:rPr>
-              <w:t>CHAT</w:t>
+              <w:t>ALMACEN_ACADEMICO</w:t>
             </w:r>
             <w:r>
               <w:rPr>
@@ -2497,7 +2564,7 @@
               <w:rPr>
                 <w:sz w:val="19"/>
               </w:rPr>
-              <w:t xml:space="preserve"> y usuario </w:t>
+              <w:t xml:space="preserve">, procedimientos y cuentas </w:t>
             </w:r>
             <w:r>
               <w:rPr>
@@ -2506,6 +2573,20 @@
                 <w:sz w:val="19"/>
               </w:rPr>
               <w:t>chat_reader</w:t>
+            </w:r>
+            <w:r>
+              <w:rPr>
+                <w:sz w:val="19"/>
+              </w:rPr>
+              <w:t xml:space="preserve"> y </w:t>
+            </w:r>
+            <w:r>
+              <w:rPr>
+                <w:rFonts w:ascii="Consolas" w:hAnsi="Consolas"/>
+                <w:color w:val="002E45"/>
+                <w:sz w:val="19"/>
+              </w:rPr>
+              <w:t>app_seguimiento</w:t>
             </w:r>
           </w:p>
         </w:tc>
@@ -2541,31 +2622,11 @@
             <w:r/>
             <w:r>
               <w:rPr>
-                <w:sz w:val="19"/>
-              </w:rPr>
-              <w:t xml:space="preserve">ETL con los perfiles </w:t>
-            </w:r>
-            <w:r>
-              <w:rPr>
                 <w:rFonts w:ascii="Consolas" w:hAnsi="Consolas"/>
                 <w:color w:val="002E45"/>
                 <w:sz w:val="19"/>
               </w:rPr>
-              <w:t>UNEMI_PRUEBAS</w:t>
-            </w:r>
-            <w:r>
-              <w:rPr>
-                <w:sz w:val="19"/>
-              </w:rPr>
-              <w:t xml:space="preserve"> y </w:t>
-            </w:r>
-            <w:r>
-              <w:rPr>
-                <w:rFonts w:ascii="Consolas" w:hAnsi="Consolas"/>
-                <w:color w:val="002E45"/>
-                <w:sz w:val="19"/>
-              </w:rPr>
-              <w:t>OULAD_UK</w:t>
+              <w:t>etl</w:t>
             </w:r>
           </w:p>
         </w:tc>
@@ -2583,7 +2644,7 @@
               <w:rPr>
                 <w:sz w:val="19"/>
               </w:rPr>
-              <w:t>Hechos y dimensiones cargados</w:t>
+              <w:t>ETL de cada institución con su perfil de mapeo, con control de calidad</w:t>
             </w:r>
           </w:p>
         </w:tc>
@@ -2617,9 +2678,11 @@
             <w:r/>
             <w:r>
               <w:rPr>
-                <w:sz w:val="19"/>
-              </w:rPr>
-              <w:t>Entrena, califica, segmenta y genera las figuras de cada institución</w:t>
+                <w:rFonts w:ascii="Consolas" w:hAnsi="Consolas"/>
+                <w:color w:val="002E45"/>
+                <w:sz w:val="19"/>
+              </w:rPr>
+              <w:t>referentes</w:t>
             </w:r>
           </w:p>
         </w:tc>
@@ -2636,7 +2699,7 @@
               <w:rPr>
                 <w:sz w:val="19"/>
               </w:rPr>
-              <w:t>Predicciones y segmentos</w:t>
+              <w:t>Tasas de abandono publicadas, con DOI</w:t>
             </w:r>
           </w:p>
         </w:tc>
@@ -2672,9 +2735,11 @@
             <w:r/>
             <w:r>
               <w:rPr>
-                <w:sz w:val="19"/>
-              </w:rPr>
-              <w:t>Carga los referentes externos</w:t>
+                <w:rFonts w:ascii="Consolas" w:hAnsi="Consolas"/>
+                <w:color w:val="002E45"/>
+                <w:sz w:val="19"/>
+              </w:rPr>
+              <w:t>entrenar</w:t>
             </w:r>
           </w:p>
         </w:tc>
@@ -2692,7 +2757,7 @@
               <w:rPr>
                 <w:sz w:val="19"/>
               </w:rPr>
-              <w:t>Benchmarking con DOI</w:t>
+              <w:t>Cuatro algoritmos, validación cruzada agrupada, prueba temporal, calibración y umbrales</w:t>
             </w:r>
           </w:p>
         </w:tc>
@@ -2726,9 +2791,11 @@
             <w:r/>
             <w:r>
               <w:rPr>
-                <w:sz w:val="19"/>
-              </w:rPr>
-              <w:t>Genera el diccionario de datos</w:t>
+                <w:rFonts w:ascii="Consolas" w:hAnsi="Consolas"/>
+                <w:color w:val="002E45"/>
+                <w:sz w:val="19"/>
+              </w:rPr>
+              <w:t>calificar</w:t>
             </w:r>
           </w:p>
         </w:tc>
@@ -2743,11 +2810,9 @@
             <w:r/>
             <w:r>
               <w:rPr>
-                <w:rFonts w:ascii="Consolas" w:hAnsi="Consolas"/>
-                <w:color w:val="002E45"/>
-                <w:sz w:val="19"/>
-              </w:rPr>
-              <w:t>documentacion/tecnica/DICCIONARIO_DE_DATOS.md</w:t>
+                <w:sz w:val="19"/>
+              </w:rPr>
+              <w:t>Probabilidad, nivel, razones SHAP y deriva (PSI) de cada estudiante activo</w:t>
             </w:r>
           </w:p>
         </w:tc>
@@ -2783,9 +2848,11 @@
             <w:r/>
             <w:r>
               <w:rPr>
-                <w:sz w:val="19"/>
-              </w:rPr>
-              <w:t>Ejecuta las pruebas principales</w:t>
+                <w:rFonts w:ascii="Consolas" w:hAnsi="Consolas"/>
+                <w:color w:val="002E45"/>
+                <w:sz w:val="19"/>
+              </w:rPr>
+              <w:t>segmentar</w:t>
             </w:r>
           </w:p>
         </w:tc>
@@ -2803,7 +2870,304 @@
               <w:rPr>
                 <w:sz w:val="19"/>
               </w:rPr>
-              <w:t>Verificación automática</w:t>
+              <w:t>Segmentos de carreras con K-means</w:t>
+            </w:r>
+          </w:p>
+        </w:tc>
+      </w:tr>
+      <w:tr>
+        <w:tc>
+          <w:tcPr>
+            <w:tcW w:type="dxa" w:w="3135"/>
+          </w:tcPr>
+          <w:p>
+            <w:pPr>
+              <w:spacing w:after="0"/>
+            </w:pPr>
+            <w:r/>
+            <w:r>
+              <w:rPr>
+                <w:sz w:val="19"/>
+              </w:rPr>
+              <w:t>11</w:t>
+            </w:r>
+          </w:p>
+        </w:tc>
+        <w:tc>
+          <w:tcPr>
+            <w:tcW w:type="dxa" w:w="3135"/>
+          </w:tcPr>
+          <w:p>
+            <w:pPr>
+              <w:spacing w:after="0"/>
+            </w:pPr>
+            <w:r/>
+            <w:r>
+              <w:rPr>
+                <w:rFonts w:ascii="Consolas" w:hAnsi="Consolas"/>
+                <w:color w:val="002E45"/>
+                <w:sz w:val="19"/>
+              </w:rPr>
+              <w:t>reportes</w:t>
+            </w:r>
+          </w:p>
+        </w:tc>
+        <w:tc>
+          <w:tcPr>
+            <w:tcW w:type="dxa" w:w="3135"/>
+          </w:tcPr>
+          <w:p>
+            <w:pPr>
+              <w:spacing w:after="0"/>
+            </w:pPr>
+            <w:r/>
+            <w:r>
+              <w:rPr>
+                <w:sz w:val="19"/>
+              </w:rPr>
+              <w:t>Figuras de validación, exploración y evaluación prospectiva</w:t>
+            </w:r>
+          </w:p>
+        </w:tc>
+      </w:tr>
+      <w:tr>
+        <w:tc>
+          <w:tcPr>
+            <w:tcW w:type="dxa" w:w="3135"/>
+            <w:shd w:val="clear" w:color="auto" w:fill="F2F6F9"/>
+          </w:tcPr>
+          <w:p>
+            <w:pPr>
+              <w:spacing w:after="0"/>
+            </w:pPr>
+            <w:r/>
+            <w:r>
+              <w:rPr>
+                <w:sz w:val="19"/>
+              </w:rPr>
+              <w:t>12</w:t>
+            </w:r>
+          </w:p>
+        </w:tc>
+        <w:tc>
+          <w:tcPr>
+            <w:tcW w:type="dxa" w:w="3135"/>
+            <w:shd w:val="clear" w:color="auto" w:fill="F2F6F9"/>
+          </w:tcPr>
+          <w:p>
+            <w:pPr>
+              <w:spacing w:after="0"/>
+            </w:pPr>
+            <w:r/>
+            <w:r>
+              <w:rPr>
+                <w:rFonts w:ascii="Consolas" w:hAnsi="Consolas"/>
+                <w:color w:val="002E45"/>
+                <w:sz w:val="19"/>
+              </w:rPr>
+              <w:t>diccionario</w:t>
+            </w:r>
+          </w:p>
+        </w:tc>
+        <w:tc>
+          <w:tcPr>
+            <w:tcW w:type="dxa" w:w="3135"/>
+            <w:shd w:val="clear" w:color="auto" w:fill="F2F6F9"/>
+          </w:tcPr>
+          <w:p>
+            <w:pPr>
+              <w:spacing w:after="0"/>
+            </w:pPr>
+            <w:r/>
+            <w:r>
+              <w:rPr>
+                <w:rFonts w:ascii="Consolas" w:hAnsi="Consolas"/>
+                <w:color w:val="002E45"/>
+                <w:sz w:val="19"/>
+              </w:rPr>
+              <w:t>documentacion/tecnica/DICCIONARIO_DE_DATOS.md</w:t>
+            </w:r>
+          </w:p>
+        </w:tc>
+      </w:tr>
+      <w:tr>
+        <w:tc>
+          <w:tcPr>
+            <w:tcW w:type="dxa" w:w="3135"/>
+          </w:tcPr>
+          <w:p>
+            <w:pPr>
+              <w:spacing w:after="0"/>
+            </w:pPr>
+            <w:r/>
+            <w:r>
+              <w:rPr>
+                <w:sz w:val="19"/>
+              </w:rPr>
+              <w:t>13</w:t>
+            </w:r>
+          </w:p>
+        </w:tc>
+        <w:tc>
+          <w:tcPr>
+            <w:tcW w:type="dxa" w:w="3135"/>
+          </w:tcPr>
+          <w:p>
+            <w:pPr>
+              <w:spacing w:after="0"/>
+            </w:pPr>
+            <w:r/>
+            <w:r>
+              <w:rPr>
+                <w:rFonts w:ascii="Consolas" w:hAnsi="Consolas"/>
+                <w:color w:val="002E45"/>
+                <w:sz w:val="19"/>
+              </w:rPr>
+              <w:t>usuarios</w:t>
+            </w:r>
+          </w:p>
+        </w:tc>
+        <w:tc>
+          <w:tcPr>
+            <w:tcW w:type="dxa" w:w="3135"/>
+          </w:tcPr>
+          <w:p>
+            <w:pPr>
+              <w:spacing w:after="0"/>
+            </w:pPr>
+            <w:r/>
+            <w:r>
+              <w:rPr>
+                <w:sz w:val="19"/>
+              </w:rPr>
+              <w:t>Cuentas de demostración, una por rol</w:t>
+            </w:r>
+          </w:p>
+        </w:tc>
+      </w:tr>
+      <w:tr>
+        <w:tc>
+          <w:tcPr>
+            <w:tcW w:type="dxa" w:w="3135"/>
+            <w:shd w:val="clear" w:color="auto" w:fill="F2F6F9"/>
+          </w:tcPr>
+          <w:p>
+            <w:pPr>
+              <w:spacing w:after="0"/>
+            </w:pPr>
+            <w:r/>
+            <w:r>
+              <w:rPr>
+                <w:sz w:val="19"/>
+              </w:rPr>
+              <w:t>14</w:t>
+            </w:r>
+          </w:p>
+        </w:tc>
+        <w:tc>
+          <w:tcPr>
+            <w:tcW w:type="dxa" w:w="3135"/>
+            <w:shd w:val="clear" w:color="auto" w:fill="F2F6F9"/>
+          </w:tcPr>
+          <w:p>
+            <w:pPr>
+              <w:spacing w:after="0"/>
+            </w:pPr>
+            <w:r/>
+            <w:r>
+              <w:rPr>
+                <w:rFonts w:ascii="Consolas" w:hAnsi="Consolas"/>
+                <w:color w:val="002E45"/>
+                <w:sz w:val="19"/>
+              </w:rPr>
+              <w:t>pruebas</w:t>
+            </w:r>
+          </w:p>
+        </w:tc>
+        <w:tc>
+          <w:tcPr>
+            <w:tcW w:type="dxa" w:w="3135"/>
+            <w:shd w:val="clear" w:color="auto" w:fill="F2F6F9"/>
+          </w:tcPr>
+          <w:p>
+            <w:pPr>
+              <w:spacing w:after="0"/>
+            </w:pPr>
+            <w:r/>
+            <w:r>
+              <w:rPr>
+                <w:sz w:val="19"/>
+              </w:rPr>
+              <w:t>Pruebas automáticas del backend</w:t>
+            </w:r>
+          </w:p>
+        </w:tc>
+      </w:tr>
+      <w:tr>
+        <w:tc>
+          <w:tcPr>
+            <w:tcW w:type="dxa" w:w="3135"/>
+          </w:tcPr>
+          <w:p>
+            <w:pPr>
+              <w:spacing w:after="0"/>
+            </w:pPr>
+            <w:r/>
+            <w:r>
+              <w:rPr>
+                <w:sz w:val="19"/>
+              </w:rPr>
+              <w:t>15</w:t>
+            </w:r>
+          </w:p>
+        </w:tc>
+        <w:tc>
+          <w:tcPr>
+            <w:tcW w:type="dxa" w:w="3135"/>
+          </w:tcPr>
+          <w:p>
+            <w:pPr>
+              <w:spacing w:after="0"/>
+            </w:pPr>
+            <w:r/>
+            <w:r>
+              <w:rPr>
+                <w:rFonts w:ascii="Consolas" w:hAnsi="Consolas"/>
+                <w:color w:val="002E45"/>
+                <w:sz w:val="19"/>
+              </w:rPr>
+              <w:t>consulta</w:t>
+            </w:r>
+          </w:p>
+        </w:tc>
+        <w:tc>
+          <w:tcPr>
+            <w:tcW w:type="dxa" w:w="3135"/>
+          </w:tcPr>
+          <w:p>
+            <w:pPr>
+              <w:spacing w:after="0"/>
+            </w:pPr>
+            <w:r/>
+            <w:r>
+              <w:rPr>
+                <w:sz w:val="19"/>
+              </w:rPr>
+              <w:t xml:space="preserve">(Solo con </w:t>
+            </w:r>
+            <w:r>
+              <w:rPr>
+                <w:rFonts w:ascii="Consolas" w:hAnsi="Consolas"/>
+                <w:color w:val="002E45"/>
+                <w:sz w:val="19"/>
+              </w:rPr>
+              <w:t>--con-consulta</w:t>
+            </w:r>
+            <w:r>
+              <w:rPr>
+                <w:sz w:val="19"/>
+              </w:rPr>
+              <w:t>) evaluación del conjunto dorado con los proveedores de IA</w:t>
             </w:r>
           </w:p>
         </w:tc>
@@ -2813,12 +3177,6 @@
       <w:pPr>
         <w:spacing w:after="40"/>
       </w:pPr>
-    </w:p>
-    <w:p>
-      <w:r>
-        <w:rPr/>
-        <w:t>Opciones del script:</w:t>
-      </w:r>
     </w:p>
     <w:tbl>
       <w:tblPr>
@@ -2897,7 +3255,7 @@
                 <w:color w:val="002E45"/>
                 <w:sz w:val="19"/>
               </w:rPr>
-              <w:t>-Levantar</w:t>
+              <w:t>--con-consulta</w:t>
             </w:r>
           </w:p>
         </w:tc>
@@ -2914,7 +3272,7 @@
               <w:rPr>
                 <w:sz w:val="19"/>
               </w:rPr>
-              <w:t>Al terminar, abre el backend y el frontend</w:t>
+              <w:t>Agrega el paso 15; consume cuota de los proveedores de IA</w:t>
             </w:r>
           </w:p>
         </w:tc>
@@ -2936,7 +3294,7 @@
                 <w:color w:val="002E45"/>
                 <w:sz w:val="19"/>
               </w:rPr>
-              <w:t>-ConEvaluacionNL2SQL</w:t>
+              <w:t>--rapido</w:t>
             </w:r>
           </w:p>
         </w:tc>
@@ -2954,7 +3312,171 @@
               <w:rPr>
                 <w:sz w:val="19"/>
               </w:rPr>
-              <w:t>Agrega la evaluación de las 40 preguntas de referencia; consume cuota de los proveedores de IA</w:t>
+              <w:t>Menos combinaciones de hiperparámetros (demostraciones)</w:t>
+            </w:r>
+          </w:p>
+        </w:tc>
+      </w:tr>
+      <w:tr>
+        <w:tc>
+          <w:tcPr>
+            <w:tcW w:type="dxa" w:w="4703"/>
+          </w:tcPr>
+          <w:p>
+            <w:pPr>
+              <w:spacing w:after="0"/>
+            </w:pPr>
+            <w:r/>
+            <w:r>
+              <w:rPr>
+                <w:rFonts w:ascii="Consolas" w:hAnsi="Consolas"/>
+                <w:color w:val="002E45"/>
+                <w:sz w:val="19"/>
+              </w:rPr>
+              <w:t>--desde PASO</w:t>
+            </w:r>
+          </w:p>
+        </w:tc>
+        <w:tc>
+          <w:tcPr>
+            <w:tcW w:type="dxa" w:w="4703"/>
+          </w:tcPr>
+          <w:p>
+            <w:pPr>
+              <w:spacing w:after="0"/>
+            </w:pPr>
+            <w:r/>
+            <w:r>
+              <w:rPr>
+                <w:sz w:val="19"/>
+              </w:rPr>
+              <w:t xml:space="preserve">Retoma desde un paso, por ejemplo </w:t>
+            </w:r>
+            <w:r>
+              <w:rPr>
+                <w:rFonts w:ascii="Consolas" w:hAnsi="Consolas"/>
+                <w:color w:val="002E45"/>
+                <w:sz w:val="19"/>
+              </w:rPr>
+              <w:t>--desde calificar</w:t>
+            </w:r>
+          </w:p>
+        </w:tc>
+      </w:tr>
+      <w:tr>
+        <w:tc>
+          <w:tcPr>
+            <w:tcW w:type="dxa" w:w="4703"/>
+            <w:shd w:val="clear" w:color="auto" w:fill="F2F6F9"/>
+          </w:tcPr>
+          <w:p>
+            <w:pPr>
+              <w:spacing w:after="0"/>
+            </w:pPr>
+            <w:r/>
+            <w:r>
+              <w:rPr>
+                <w:rFonts w:ascii="Consolas" w:hAnsi="Consolas"/>
+                <w:color w:val="002E45"/>
+                <w:sz w:val="19"/>
+              </w:rPr>
+              <w:t>--solo PASO1,PASO2</w:t>
+            </w:r>
+          </w:p>
+        </w:tc>
+        <w:tc>
+          <w:tcPr>
+            <w:tcW w:type="dxa" w:w="4703"/>
+            <w:shd w:val="clear" w:color="auto" w:fill="F2F6F9"/>
+          </w:tcPr>
+          <w:p>
+            <w:pPr>
+              <w:spacing w:after="0"/>
+            </w:pPr>
+            <w:r/>
+            <w:r>
+              <w:rPr>
+                <w:sz w:val="19"/>
+              </w:rPr>
+              <w:t>Ejecuta solo esos pasos</w:t>
+            </w:r>
+          </w:p>
+        </w:tc>
+      </w:tr>
+      <w:tr>
+        <w:tc>
+          <w:tcPr>
+            <w:tcW w:type="dxa" w:w="4703"/>
+          </w:tcPr>
+          <w:p>
+            <w:pPr>
+              <w:spacing w:after="0"/>
+            </w:pPr>
+            <w:r/>
+            <w:r>
+              <w:rPr>
+                <w:rFonts w:ascii="Consolas" w:hAnsi="Consolas"/>
+                <w:color w:val="002E45"/>
+                <w:sz w:val="19"/>
+              </w:rPr>
+              <w:t>--sin-oulad</w:t>
+            </w:r>
+          </w:p>
+        </w:tc>
+        <w:tc>
+          <w:tcPr>
+            <w:tcW w:type="dxa" w:w="4703"/>
+          </w:tcPr>
+          <w:p>
+            <w:pPr>
+              <w:spacing w:after="0"/>
+            </w:pPr>
+            <w:r/>
+            <w:r>
+              <w:rPr>
+                <w:sz w:val="19"/>
+              </w:rPr>
+              <w:t>Omite la institución OULAD_UK</w:t>
+            </w:r>
+          </w:p>
+        </w:tc>
+      </w:tr>
+      <w:tr>
+        <w:tc>
+          <w:tcPr>
+            <w:tcW w:type="dxa" w:w="4703"/>
+            <w:shd w:val="clear" w:color="auto" w:fill="F2F6F9"/>
+          </w:tcPr>
+          <w:p>
+            <w:pPr>
+              <w:spacing w:after="0"/>
+            </w:pPr>
+            <w:r/>
+            <w:r>
+              <w:rPr>
+                <w:rFonts w:ascii="Consolas" w:hAnsi="Consolas"/>
+                <w:color w:val="002E45"/>
+                <w:sz w:val="19"/>
+              </w:rPr>
+              <w:t>--reentrenar INST1,INST2</w:t>
+            </w:r>
+          </w:p>
+        </w:tc>
+        <w:tc>
+          <w:tcPr>
+            <w:tcW w:type="dxa" w:w="4703"/>
+            <w:shd w:val="clear" w:color="auto" w:fill="F2F6F9"/>
+          </w:tcPr>
+          <w:p>
+            <w:pPr>
+              <w:spacing w:after="0"/>
+            </w:pPr>
+            <w:r/>
+            <w:r>
+              <w:rPr>
+                <w:sz w:val="19"/>
+              </w:rPr>
+              <w:t>Entrena solo esas instituciones; las demás conservan su modelo</w:t>
             </w:r>
           </w:p>
         </w:tc>
@@ -2967,58 +3489,16 @@
     </w:p>
     <w:p>
       <w:pPr>
-        <w:pStyle w:val="Heading3"/>
+        <w:pStyle w:val="Heading2"/>
       </w:pPr>
       <w:r>
-        <w:t>Opción B — Trasladar el contenedor ya cargado</w:t>
+        <w:t>7. Cuentas de la aplicación</w:t>
       </w:r>
     </w:p>
     <w:p>
       <w:r>
         <w:rPr/>
-        <w:t>En la computadora original:</w:t>
-      </w:r>
-    </w:p>
-    <w:p>
-      <w:pPr>
-        <w:shd w:val="clear" w:color="auto" w:fill="F2F4F6"/>
-        <w:ind w:left="170"/>
-      </w:pPr>
-      <w:r>
-        <w:rPr>
-          <w:rFonts w:ascii="Consolas" w:hAnsi="Consolas"/>
-          <w:sz w:val="17"/>
-        </w:rPr>
-        <w:t>docker commit vicmar-sqlserver vicmar-sqlserver-portable:ultima</w:t>
-        <w:br/>
-        <w:t>docker save -o vicmar-sqlserver-respaldo.tar vicmar-sqlserver-portable:ultima</w:t>
-      </w:r>
-    </w:p>
-    <w:p>
-      <w:r>
-        <w:rPr/>
-        <w:t>En la computadora nueva:</w:t>
-      </w:r>
-    </w:p>
-    <w:p>
-      <w:pPr>
-        <w:shd w:val="clear" w:color="auto" w:fill="F2F4F6"/>
-        <w:ind w:left="170"/>
-      </w:pPr>
-      <w:r>
-        <w:rPr>
-          <w:rFonts w:ascii="Consolas" w:hAnsi="Consolas"/>
-          <w:sz w:val="17"/>
-        </w:rPr>
-        <w:t>docker load -i vicmar-sqlserver-respaldo.tar</w:t>
-        <w:br/>
-        <w:t>docker run -d --name vicmar-sqlserver --restart unless-stopped -p 1433:1433 vicmar-sqlserver-portable:ultima</w:t>
-      </w:r>
-    </w:p>
-    <w:p>
-      <w:r>
-        <w:rPr/>
-        <w:t xml:space="preserve">Las contraseñas de </w:t>
+        <w:t xml:space="preserve">El paso </w:t>
       </w:r>
       <w:r>
         <w:rPr>
@@ -3026,11 +3506,21 @@
           <w:color w:val="002E45"/>
           <w:sz w:val="19"/>
         </w:rPr>
-        <w:t>sa</w:t>
+        <w:t>usuarios</w:t>
       </w:r>
       <w:r>
         <w:rPr/>
-        <w:t xml:space="preserve"> y </w:t>
+        <w:t xml:space="preserve"> crea tres cuentas de demostración con contraseñas aleatorias que se guardan </w:t>
+      </w:r>
+      <w:r>
+        <w:rPr>
+          <w:b/>
+        </w:rPr>
+        <w:t>solo</w:t>
+      </w:r>
+      <w:r>
+        <w:rPr/>
+        <w:t xml:space="preserve"> en </w:t>
       </w:r>
       <w:r>
         <w:rPr>
@@ -3038,66 +3528,11 @@
           <w:color w:val="002E45"/>
           <w:sz w:val="19"/>
         </w:rPr>
-        <w:t>chat_reader</w:t>
+        <w:t>codigo_fuente\backend\datos_locales\usuarios_demo.local.json</w:t>
       </w:r>
       <w:r>
         <w:rPr/>
-        <w:t xml:space="preserve"> son las del contenedor original; </w:t>
-      </w:r>
-      <w:r>
-        <w:rPr>
-          <w:rFonts w:ascii="Consolas" w:hAnsi="Consolas"/>
-          <w:color w:val="002E45"/>
-          <w:sz w:val="19"/>
-        </w:rPr>
-        <w:t>.env</w:t>
-      </w:r>
-      <w:r>
-        <w:rPr/>
-        <w:t xml:space="preserve"> debe usar las mismas.</w:t>
-      </w:r>
-    </w:p>
-    <w:p>
-      <w:pPr>
-        <w:pStyle w:val="Heading2"/>
-      </w:pPr>
-      <w:r>
-        <w:t>6. Usuarios de la aplicación</w:t>
-      </w:r>
-    </w:p>
-    <w:p>
-      <w:r>
-        <w:rPr/>
-        <w:t xml:space="preserve">Los usuarios viven en </w:t>
-      </w:r>
-      <w:r>
-        <w:rPr>
-          <w:rFonts w:ascii="Consolas" w:hAnsi="Consolas"/>
-          <w:color w:val="002E45"/>
-          <w:sz w:val="19"/>
-        </w:rPr>
-        <w:t>codigo_fuente\backend\security_config.json</w:t>
-      </w:r>
-      <w:r>
-        <w:rPr/>
-        <w:t>, que no se versiona. En una instalación nueva el script lo crea con los roles por defecto:</w:t>
-      </w:r>
-    </w:p>
-    <w:p>
-      <w:pPr>
-        <w:shd w:val="clear" w:color="auto" w:fill="F2F4F6"/>
-        <w:ind w:left="170"/>
-      </w:pPr>
-      <w:r>
-        <w:rPr>
-          <w:rFonts w:ascii="Consolas" w:hAnsi="Consolas"/>
-          <w:sz w:val="17"/>
-        </w:rPr>
-        <w:t>cd codigo_fuente\backend</w:t>
-        <w:br/>
-        <w:t>venv\Scripts\python.exe scripts\fijar_passwords_prueba.py</w:t>
-        <w:br/>
-        <w:t>cd ..\..</w:t>
+        <w:t>:</w:t>
       </w:r>
     </w:p>
     <w:tbl>
@@ -3181,7 +3616,7 @@
                 <w:color w:val="FFFFFF"/>
                 <w:sz w:val="19"/>
               </w:rPr>
-              <w:t>Qué puede hacer</w:t>
+              <w:t>Uso</w:t>
             </w:r>
           </w:p>
         </w:tc>
@@ -3202,7 +3637,7 @@
                 <w:color w:val="002E45"/>
                 <w:sz w:val="19"/>
               </w:rPr>
-              <w:t>acad</w:t>
+              <w:t>autoridad.demo</w:t>
             </w:r>
           </w:p>
         </w:tc>
@@ -3219,7 +3654,7 @@
               <w:rPr>
                 <w:sz w:val="19"/>
               </w:rPr>
-              <w:t>ACADÉMICO</w:t>
+              <w:t>Autoridad académica</w:t>
             </w:r>
           </w:p>
         </w:tc>
@@ -3236,7 +3671,7 @@
               <w:rPr>
                 <w:sz w:val="19"/>
               </w:rPr>
-              <w:t>Panel de riesgo, inteligencia institucional y chat académico</w:t>
+              <w:t>Decanato o dirección de carrera</w:t>
             </w:r>
           </w:p>
         </w:tc>
@@ -3258,7 +3693,7 @@
                 <w:color w:val="002E45"/>
                 <w:sz w:val="19"/>
               </w:rPr>
-              <w:t>clec</w:t>
+              <w:t>bienestar.demo</w:t>
             </w:r>
           </w:p>
         </w:tc>
@@ -3276,7 +3711,7 @@
               <w:rPr>
                 <w:sz w:val="19"/>
               </w:rPr>
-              <w:t>ADMINISTRADOR</w:t>
+              <w:t>Bienestar estudiantil</w:t>
             </w:r>
           </w:p>
         </w:tc>
@@ -3294,7 +3729,7 @@
               <w:rPr>
                 <w:sz w:val="19"/>
               </w:rPr>
-              <w:t>Todo, más la gestión de usuarios y la auditoría</w:t>
+              <w:t>Tutoría y consejería; registra intervenciones</w:t>
             </w:r>
           </w:p>
         </w:tc>
@@ -3315,7 +3750,7 @@
                 <w:color w:val="002E45"/>
                 <w:sz w:val="19"/>
               </w:rPr>
-              <w:t>cont</w:t>
+              <w:t>admin.ti</w:t>
             </w:r>
           </w:p>
         </w:tc>
@@ -3332,7 +3767,7 @@
               <w:rPr>
                 <w:sz w:val="19"/>
               </w:rPr>
-              <w:t>CONTABILIDAD</w:t>
+              <w:t>Administración de TI</w:t>
             </w:r>
           </w:p>
         </w:tc>
@@ -3349,178 +3784,7 @@
               <w:rPr>
                 <w:sz w:val="19"/>
               </w:rPr>
-              <w:t>Módulos de finanzas y ventas (no ve datos académicos)</w:t>
-            </w:r>
-          </w:p>
-        </w:tc>
-      </w:tr>
-      <w:tr>
-        <w:tc>
-          <w:tcPr>
-            <w:tcW w:type="dxa" w:w="3135"/>
-            <w:shd w:val="clear" w:color="auto" w:fill="F2F6F9"/>
-          </w:tcPr>
-          <w:p>
-            <w:pPr>
-              <w:spacing w:after="0"/>
-            </w:pPr>
-            <w:r/>
-            <w:r>
-              <w:rPr>
-                <w:rFonts w:ascii="Consolas" w:hAnsi="Consolas"/>
-                <w:color w:val="002E45"/>
-                <w:sz w:val="19"/>
-              </w:rPr>
-              <w:t>rrhh</w:t>
-            </w:r>
-          </w:p>
-        </w:tc>
-        <w:tc>
-          <w:tcPr>
-            <w:tcW w:type="dxa" w:w="3135"/>
-            <w:shd w:val="clear" w:color="auto" w:fill="F2F6F9"/>
-          </w:tcPr>
-          <w:p>
-            <w:pPr>
-              <w:spacing w:after="0"/>
-            </w:pPr>
-            <w:r/>
-            <w:r>
-              <w:rPr>
-                <w:sz w:val="19"/>
-              </w:rPr>
-              <w:t>RRHH</w:t>
-            </w:r>
-          </w:p>
-        </w:tc>
-        <w:tc>
-          <w:tcPr>
-            <w:tcW w:type="dxa" w:w="3135"/>
-            <w:shd w:val="clear" w:color="auto" w:fill="F2F6F9"/>
-          </w:tcPr>
-          <w:p>
-            <w:pPr>
-              <w:spacing w:after="0"/>
-            </w:pPr>
-            <w:r/>
-            <w:r>
-              <w:rPr>
-                <w:sz w:val="19"/>
-              </w:rPr>
-              <w:t>Módulo de talento humano</w:t>
-            </w:r>
-          </w:p>
-        </w:tc>
-      </w:tr>
-      <w:tr>
-        <w:tc>
-          <w:tcPr>
-            <w:tcW w:type="dxa" w:w="3135"/>
-          </w:tcPr>
-          <w:p>
-            <w:pPr>
-              <w:spacing w:after="0"/>
-            </w:pPr>
-            <w:r/>
-            <w:r>
-              <w:rPr>
-                <w:rFonts w:ascii="Consolas" w:hAnsi="Consolas"/>
-                <w:color w:val="002E45"/>
-                <w:sz w:val="19"/>
-              </w:rPr>
-              <w:t>logi</w:t>
-            </w:r>
-          </w:p>
-        </w:tc>
-        <w:tc>
-          <w:tcPr>
-            <w:tcW w:type="dxa" w:w="3135"/>
-          </w:tcPr>
-          <w:p>
-            <w:pPr>
-              <w:spacing w:after="0"/>
-            </w:pPr>
-            <w:r/>
-            <w:r>
-              <w:rPr>
-                <w:sz w:val="19"/>
-              </w:rPr>
-              <w:t>LOGÍSTICA</w:t>
-            </w:r>
-          </w:p>
-        </w:tc>
-        <w:tc>
-          <w:tcPr>
-            <w:tcW w:type="dxa" w:w="3135"/>
-          </w:tcPr>
-          <w:p>
-            <w:pPr>
-              <w:spacing w:after="0"/>
-            </w:pPr>
-            <w:r/>
-            <w:r>
-              <w:rPr>
-                <w:sz w:val="19"/>
-              </w:rPr>
-              <w:t>Módulo de operaciones</w:t>
-            </w:r>
-          </w:p>
-        </w:tc>
-      </w:tr>
-      <w:tr>
-        <w:tc>
-          <w:tcPr>
-            <w:tcW w:type="dxa" w:w="3135"/>
-            <w:shd w:val="clear" w:color="auto" w:fill="F2F6F9"/>
-          </w:tcPr>
-          <w:p>
-            <w:pPr>
-              <w:spacing w:after="0"/>
-            </w:pPr>
-            <w:r/>
-            <w:r>
-              <w:rPr>
-                <w:rFonts w:ascii="Consolas" w:hAnsi="Consolas"/>
-                <w:color w:val="002E45"/>
-                <w:sz w:val="19"/>
-              </w:rPr>
-              <w:t>demo</w:t>
-            </w:r>
-          </w:p>
-        </w:tc>
-        <w:tc>
-          <w:tcPr>
-            <w:tcW w:type="dxa" w:w="3135"/>
-            <w:shd w:val="clear" w:color="auto" w:fill="F2F6F9"/>
-          </w:tcPr>
-          <w:p>
-            <w:pPr>
-              <w:spacing w:after="0"/>
-            </w:pPr>
-            <w:r/>
-            <w:r>
-              <w:rPr>
-                <w:sz w:val="19"/>
-              </w:rPr>
-              <w:t>INVITADO</w:t>
-            </w:r>
-          </w:p>
-        </w:tc>
-        <w:tc>
-          <w:tcPr>
-            <w:tcW w:type="dxa" w:w="3135"/>
-            <w:shd w:val="clear" w:color="auto" w:fill="F2F6F9"/>
-          </w:tcPr>
-          <w:p>
-            <w:pPr>
-              <w:spacing w:after="0"/>
-            </w:pPr>
-            <w:r/>
-            <w:r>
-              <w:rPr>
-                <w:sz w:val="19"/>
-              </w:rPr>
-              <w:t>Demostración con datos ficticios, sin conectarse a ninguna base</w:t>
+              <w:t>Cuentas, auditoría y estado del sistema</w:t>
             </w:r>
           </w:p>
         </w:tc>
@@ -3534,7 +3798,61 @@
     <w:p>
       <w:r>
         <w:rPr/>
-        <w:t>Para la cuenta protegida del desarrollador (opcional), la contraseña se pasa explícitamente:</w:t>
+        <w:t xml:space="preserve">Para generar contraseñas nuevas: </w:t>
+      </w:r>
+      <w:r>
+        <w:rPr>
+          <w:rFonts w:ascii="Consolas" w:hAnsi="Consolas"/>
+          <w:color w:val="002E45"/>
+          <w:sz w:val="19"/>
+        </w:rPr>
+        <w:t>cd codigo_fuente\backend</w:t>
+      </w:r>
+      <w:r>
+        <w:rPr/>
+        <w:t xml:space="preserve"> y </w:t>
+      </w:r>
+      <w:r>
+        <w:rPr>
+          <w:rFonts w:ascii="Consolas" w:hAnsi="Consolas"/>
+          <w:color w:val="002E45"/>
+          <w:sz w:val="19"/>
+        </w:rPr>
+        <w:t>venv\Scripts\python -m scripts.crear_usuarios_demo --restablecer</w:t>
+      </w:r>
+      <w:r>
+        <w:rPr/>
+        <w:t xml:space="preserve">. Las cuentas reales se crean desde </w:t>
+      </w:r>
+      <w:r>
+        <w:rPr>
+          <w:b/>
+        </w:rPr>
+        <w:t>Usuarios y roles</w:t>
+      </w:r>
+      <w:r>
+        <w:rPr/>
+        <w:t xml:space="preserve"> con </w:t>
+      </w:r>
+      <w:r>
+        <w:rPr>
+          <w:rFonts w:ascii="Consolas" w:hAnsi="Consolas"/>
+          <w:color w:val="002E45"/>
+          <w:sz w:val="19"/>
+        </w:rPr>
+        <w:t>admin.ti</w:t>
+      </w:r>
+      <w:r>
+        <w:rPr/>
+        <w:t>.</w:t>
+      </w:r>
+    </w:p>
+    <w:p>
+      <w:pPr>
+        <w:pStyle w:val="Heading2"/>
+      </w:pPr>
+      <w:r>
+        <w:t>8. Encender y apagar el sistema</w:t>
       </w:r>
     </w:p>
     <w:p>
@@ -3547,67 +3865,25 @@
           <w:rFonts w:ascii="Consolas" w:hAnsi="Consolas"/>
           <w:sz w:val="17"/>
         </w:rPr>
-        <w:t>cd codigo_fuente\backend</w:t>
-        <w:br/>
-        <w:t>venv\Scripts\python.exe scripts\crear_usuario_desarrollador.py --password "&lt;clave de 8 o más caracteres&gt;"</w:t>
-      </w:r>
-    </w:p>
-    <w:p>
-      <w:pPr>
-        <w:pStyle w:val="Heading2"/>
-      </w:pPr>
-      <w:r>
-        <w:t>7. Encender el sistema</w:t>
+        <w:t>codigo_fuente\scripts\levantar_sistema.bat</w:t>
       </w:r>
     </w:p>
     <w:p>
       <w:r>
         <w:rPr/>
-        <w:t>Instale las dependencias del frontend la primera vez:</w:t>
+        <w:t xml:space="preserve">Inicia el contenedor, abre la API en una ventana y la aplicación web en otra (instala lo que falte con </w:t>
       </w:r>
-    </w:p>
-    <w:p>
-      <w:pPr>
-        <w:shd w:val="clear" w:color="auto" w:fill="F2F4F6"/>
-        <w:ind w:left="170"/>
-      </w:pPr>
       <w:r>
         <w:rPr>
           <w:rFonts w:ascii="Consolas" w:hAnsi="Consolas"/>
-          <w:sz w:val="17"/>
+          <w:color w:val="002E45"/>
+          <w:sz w:val="19"/>
         </w:rPr>
-        <w:t>cd codigo_fuente\frontend</w:t>
-        <w:br/>
         <w:t>npm install</w:t>
       </w:r>
-    </w:p>
-    <w:p>
       <w:r>
         <w:rPr/>
-        <w:t>Luego, cada vez que quiera usar el sistema:</w:t>
-      </w:r>
-    </w:p>
-    <w:p>
-      <w:pPr>
-        <w:shd w:val="clear" w:color="auto" w:fill="F2F4F6"/>
-        <w:ind w:left="170"/>
-      </w:pPr>
-      <w:r>
-        <w:rPr>
-          <w:rFonts w:ascii="Consolas" w:hAnsi="Consolas"/>
-          <w:sz w:val="17"/>
-        </w:rPr>
-        <w:t>docker start vicmar-sqlserver                     # 1. base de datos</w:t>
-        <w:br/>
-        <w:t>cd codigo_fuente\frontend; npm run dev:backend    # 2. backend (terminal 1, déjela abierta)</w:t>
-        <w:br/>
-        <w:t>cd codigo_fuente\frontend; npm run dev            # 3. frontend (terminal 2, déjela abierta)</w:t>
-      </w:r>
-    </w:p>
-    <w:p>
-      <w:r>
-        <w:rPr/>
-        <w:t xml:space="preserve">Abra </w:t>
+        <w:t xml:space="preserve">). Abra </w:t>
       </w:r>
       <w:r>
         <w:rPr/>
@@ -3615,7 +3891,7 @@
       </w:r>
       <w:r>
         <w:rPr/>
-        <w:t xml:space="preserve"> en el navegador. Para apagar: cierre las dos terminales y ejecute </w:t>
+        <w:t xml:space="preserve">. Para apagar: cierre las dos ventanas y, si quiere, </w:t>
       </w:r>
       <w:r>
         <w:rPr>
@@ -3635,7 +3911,7 @@
         <w:pStyle w:val="Heading2"/>
       </w:pPr>
       <w:r>
-        <w:t>8. Verificación de la instalación</w:t>
+        <w:t>9. Verificación de la instalación</w:t>
       </w:r>
     </w:p>
     <w:tbl>
@@ -3780,7 +4056,7 @@
               <w:rPr>
                 <w:sz w:val="19"/>
               </w:rPr>
-              <w:t>El backend está vivo</w:t>
+              <w:t>La API está viva</w:t>
             </w:r>
           </w:p>
         </w:tc>
@@ -3797,13 +4073,7 @@
               <w:rPr>
                 <w:sz w:val="19"/>
               </w:rPr>
-              <w:t xml:space="preserve">Abrir </w:t>
-            </w:r>
-            <w:r>
-              <w:rPr>
-                <w:sz w:val="19"/>
-              </w:rPr>
-              <w:t>http://127.0.0.1:8090/api/health</w:t>
+              <w:t>http://127.0.0.1:8090/api/salud</w:t>
             </w:r>
           </w:p>
         </w:tc>
@@ -3822,7 +4092,7 @@
                 <w:color w:val="002E45"/>
                 <w:sz w:val="19"/>
               </w:rPr>
-              <w:t>{"status":"online", ...}</w:t>
+              <w:t>{"estado": "ok", "version": "3...", "proveedores_ia": [...]}</w:t>
             </w:r>
           </w:p>
         </w:tc>
@@ -3878,12 +4148,6 @@
               <w:rPr>
                 <w:sz w:val="19"/>
               </w:rPr>
-              <w:t xml:space="preserve">Abrir </w:t>
-            </w:r>
-            <w:r>
-              <w:rPr>
-                <w:sz w:val="19"/>
-              </w:rPr>
               <w:t>http://127.0.0.1:8090/docs</w:t>
             </w:r>
           </w:p>
@@ -3902,7 +4166,7 @@
               <w:rPr>
                 <w:sz w:val="19"/>
               </w:rPr>
-              <w:t>Página «Swagger UI» con las rutas de la API</w:t>
+              <w:t>Swagger UI con los 27 servicios</w:t>
             </w:r>
           </w:p>
         </w:tc>
@@ -3938,7 +4202,7 @@
               <w:rPr>
                 <w:sz w:val="19"/>
               </w:rPr>
-              <w:t>Inicio de sesión</w:t>
+              <w:t>Ingreso</w:t>
             </w:r>
           </w:p>
         </w:tc>
@@ -3963,7 +4227,7 @@
                 <w:color w:val="002E45"/>
                 <w:sz w:val="19"/>
               </w:rPr>
-              <w:t>acad</w:t>
+              <w:t>autoridad.demo</w:t>
             </w:r>
           </w:p>
         </w:tc>
@@ -3980,7 +4244,20 @@
               <w:rPr>
                 <w:sz w:val="19"/>
               </w:rPr>
-              <w:t>Aparece el área de consulta con «Academia · ACADÉMICO» arriba a la derecha</w:t>
+              <w:t xml:space="preserve">Se abre el </w:t>
+            </w:r>
+            <w:r>
+              <w:rPr>
+                <w:b/>
+                <w:sz w:val="19"/>
+              </w:rPr>
+              <w:t>Panel ejecutivo</w:t>
+            </w:r>
+            <w:r>
+              <w:rPr>
+                <w:sz w:val="19"/>
+              </w:rPr>
+              <w:t xml:space="preserve"> con el saludo y la fecha de calificación</w:t>
             </w:r>
           </w:p>
         </w:tc>
@@ -4018,7 +4295,7 @@
               <w:rPr>
                 <w:sz w:val="19"/>
               </w:rPr>
-              <w:t>Conexión a la base</w:t>
+              <w:t>Datos de la primera institución</w:t>
             </w:r>
           </w:p>
         </w:tc>
@@ -4036,13 +4313,15 @@
               <w:rPr>
                 <w:sz w:val="19"/>
               </w:rPr>
-              <w:t xml:space="preserve">Seguir el </w:t>
-            </w:r>
-            <w:r>
-              <w:rPr>
-                <w:sz w:val="19"/>
-              </w:rPr>
-              <w:t>Manual de usuario, sección 3</w:t>
+              <w:t xml:space="preserve">Selector de institución → </w:t>
+            </w:r>
+            <w:r>
+              <w:rPr>
+                <w:rFonts w:ascii="Consolas" w:hAnsi="Consolas"/>
+                <w:color w:val="002E45"/>
+                <w:sz w:val="19"/>
+              </w:rPr>
+              <w:t>UNEMI_PRUEBAS</w:t>
             </w:r>
           </w:p>
         </w:tc>
@@ -4060,7 +4339,7 @@
               <w:rPr>
                 <w:sz w:val="19"/>
               </w:rPr>
-              <w:t>«Conexión establecida con localhost,1433» y 4 bases detectadas</w:t>
+              <w:t>Indicadores con estudiantes en riesgo alto, medio y bajo</w:t>
             </w:r>
           </w:p>
         </w:tc>
@@ -4096,7 +4375,7 @@
               <w:rPr>
                 <w:sz w:val="19"/>
               </w:rPr>
-              <w:t>Panel de riesgo</w:t>
+              <w:t>Segunda institución</w:t>
             </w:r>
           </w:p>
         </w:tc>
@@ -4113,7 +4392,7 @@
               <w:rPr>
                 <w:sz w:val="19"/>
               </w:rPr>
-              <w:t xml:space="preserve">Elegir </w:t>
+              <w:t xml:space="preserve">Selector → </w:t>
             </w:r>
             <w:r>
               <w:rPr>
@@ -4121,20 +4400,7 @@
                 <w:color w:val="002E45"/>
                 <w:sz w:val="19"/>
               </w:rPr>
-              <w:t>UNEMI_PRUEBAS</w:t>
-            </w:r>
-            <w:r>
-              <w:rPr>
-                <w:sz w:val="19"/>
-              </w:rPr>
-              <w:t xml:space="preserve"> → </w:t>
-            </w:r>
-            <w:r>
-              <w:rPr>
-                <w:b/>
-                <w:sz w:val="19"/>
-              </w:rPr>
-              <w:t>Indicadores</w:t>
+              <w:t>OULAD_UK</w:t>
             </w:r>
           </w:p>
         </w:tc>
@@ -4151,7 +4417,7 @@
               <w:rPr>
                 <w:sz w:val="19"/>
               </w:rPr>
-              <w:t>Tarjeta «Riesgo de abandono estudiantil» con alumnos ALTO, MEDIO y BAJO</w:t>
+              <w:t>El mismo panel con los datos de la Open University</w:t>
             </w:r>
           </w:p>
         </w:tc>
@@ -4189,7 +4455,7 @@
               <w:rPr>
                 <w:sz w:val="19"/>
               </w:rPr>
-              <w:t>Segunda institución</w:t>
+              <w:t>Consulta conversacional</w:t>
             </w:r>
           </w:p>
         </w:tc>
@@ -4207,28 +4473,7 @@
               <w:rPr>
                 <w:sz w:val="19"/>
               </w:rPr>
-              <w:t xml:space="preserve">Elegir </w:t>
-            </w:r>
-            <w:r>
-              <w:rPr>
-                <w:rFonts w:ascii="Consolas" w:hAnsi="Consolas"/>
-                <w:color w:val="002E45"/>
-                <w:sz w:val="19"/>
-              </w:rPr>
-              <w:t>OULAD_PRUEBAS</w:t>
-            </w:r>
-            <w:r>
-              <w:rPr>
-                <w:sz w:val="19"/>
-              </w:rPr>
-              <w:t xml:space="preserve"> → </w:t>
-            </w:r>
-            <w:r>
-              <w:rPr>
-                <w:b/>
-                <w:sz w:val="19"/>
-              </w:rPr>
-              <w:t>Indicadores</w:t>
+              <w:t>Preguntar «¿Cuántos estudiantes están en riesgo alto?»</w:t>
             </w:r>
           </w:p>
         </w:tc>
@@ -4246,7 +4491,14 @@
               <w:rPr>
                 <w:sz w:val="19"/>
               </w:rPr>
-              <w:t>El mismo panel con estudiantes «Estudiante OU …»</w:t>
+              <w:t xml:space="preserve">Respuesta con la etiqueta </w:t>
+            </w:r>
+            <w:r>
+              <w:rPr>
+                <w:b/>
+                <w:sz w:val="19"/>
+              </w:rPr>
+              <w:t>Métrica certificada</w:t>
             </w:r>
           </w:p>
         </w:tc>
@@ -4282,7 +4534,7 @@
               <w:rPr>
                 <w:sz w:val="19"/>
               </w:rPr>
-              <w:t>Chat</w:t>
+              <w:t>Estado de los procesos</w:t>
             </w:r>
           </w:p>
         </w:tc>
@@ -4299,7 +4551,28 @@
               <w:rPr>
                 <w:sz w:val="19"/>
               </w:rPr>
-              <w:t>Preguntar «¿Cuántos alumnos hay en cada nivel de riesgo de abandono?»</w:t>
+              <w:t xml:space="preserve">Entrar con </w:t>
+            </w:r>
+            <w:r>
+              <w:rPr>
+                <w:rFonts w:ascii="Consolas" w:hAnsi="Consolas"/>
+                <w:color w:val="002E45"/>
+                <w:sz w:val="19"/>
+              </w:rPr>
+              <w:t>admin.ti</w:t>
+            </w:r>
+            <w:r>
+              <w:rPr>
+                <w:sz w:val="19"/>
+              </w:rPr>
+              <w:t xml:space="preserve"> → </w:t>
+            </w:r>
+            <w:r>
+              <w:rPr>
+                <w:b/>
+                <w:sz w:val="19"/>
+              </w:rPr>
+              <w:t>Estado del sistema</w:t>
             </w:r>
           </w:p>
         </w:tc>
@@ -4316,7 +4589,7 @@
               <w:rPr>
                 <w:sz w:val="19"/>
               </w:rPr>
-              <w:t>Tabla con ALTO, MEDIO, BAJO y el total</w:t>
+              <w:t>Todos los pasos de la última corrida en verde</w:t>
             </w:r>
           </w:p>
         </w:tc>
@@ -4338,7 +4611,7 @@
       </w:r>
       <w:r>
         <w:rPr/>
-        <w:t xml:space="preserve"> amplía esta verificación con todos los casos de prueba.</w:t>
+        <w:t xml:space="preserve"> amplía esta verificación.</w:t>
       </w:r>
     </w:p>
     <w:p>
@@ -4346,7 +4619,7 @@
         <w:pStyle w:val="Heading2"/>
       </w:pPr>
       <w:r>
-        <w:t>9. Pruebas automáticas</w:t>
+        <w:t>10. Pruebas automáticas</w:t>
       </w:r>
     </w:p>
     <w:p>
@@ -4361,32 +4634,13 @@
         </w:rPr>
         <w:t>cd codigo_fuente\backend</w:t>
         <w:br/>
-        <w:t>venv\Scripts\python.exe -m pytest                       # backend: unitarias e integración</w:t>
-        <w:br/>
-        <w:t>venv\Scripts\python.exe -m eval.evaluar_nl2sql          # 40 preguntas de referencia (usa cuota de IA)</w:t>
-        <w:br/>
+        <w:t>venv\Scripts\python -m pytest -q          :: 153 pruebas; las 8 de integración se omiten sin SQL Server</w:t>
         <w:br/>
         <w:t>cd ..\frontend</w:t>
         <w:br/>
-        <w:t>npm test                                                # frontend (vitest)</w:t>
+        <w:t>npm test                                  :: 11 pruebas de la interfaz (vitest)</w:t>
         <w:br/>
-        <w:t>npm run build                                           # compilación de producción</w:t>
-      </w:r>
-    </w:p>
-    <w:p>
-      <w:r>
-        <w:rPr/>
-        <w:t xml:space="preserve">Resultado esperado del backend: todas las pruebas en verde; las de integración se omiten si SQL Server no está disponible. En GitHub las mismas pruebas corren solas con cada cambio (insignia </w:t>
-      </w:r>
-      <w:r>
-        <w:rPr>
-          <w:b/>
-        </w:rPr>
-        <w:t>CI</w:t>
-      </w:r>
-      <w:r>
-        <w:rPr/>
-        <w:t xml:space="preserve"> del README).</w:t>
+        <w:t>npm run build                             :: verificación de tipos y compilación de producción</w:t>
       </w:r>
     </w:p>
     <w:p>
@@ -4394,13 +4648,7 @@
         <w:pStyle w:val="Heading2"/>
       </w:pPr>
       <w:r>
-        <w:t>10. Respaldo y restauración de la base</w:t>
-      </w:r>
-    </w:p>
-    <w:p>
-      <w:r>
-        <w:rPr/>
-        <w:t>Respaldo del contenedor completo (bases, usuarios y modelos cargados):</w:t>
+        <w:t>11. Respaldo y traslado de la base</w:t>
       </w:r>
     </w:p>
     <w:p>
@@ -4421,15 +4669,7 @@
     <w:p>
       <w:r>
         <w:rPr/>
-        <w:t xml:space="preserve">Restauración: igual que la </w:t>
-      </w:r>
-      <w:r>
-        <w:rPr/>
-        <w:t>opción B del paso 5</w:t>
-      </w:r>
-      <w:r>
-        <w:rPr/>
-        <w:t xml:space="preserve">, con el archivo </w:t>
+        <w:t xml:space="preserve">En la computadora nueva: </w:t>
       </w:r>
       <w:r>
         <w:rPr>
@@ -4437,11 +4677,71 @@
           <w:color w:val="002E45"/>
           <w:sz w:val="19"/>
         </w:rPr>
-        <w:t>.tar</w:t>
+        <w:t>docker load -i vicmar-respaldo-AAAA-MM-DD.tar</w:t>
       </w:r>
       <w:r>
         <w:rPr/>
-        <w:t xml:space="preserve"> del respaldo.</w:t>
+        <w:t xml:space="preserve"> y </w:t>
+      </w:r>
+      <w:r>
+        <w:rPr>
+          <w:rFonts w:ascii="Consolas" w:hAnsi="Consolas"/>
+          <w:color w:val="002E45"/>
+          <w:sz w:val="19"/>
+        </w:rPr>
+        <w:t>docker run</w:t>
+      </w:r>
+      <w:r>
+        <w:rPr/>
+        <w:t xml:space="preserve"> como en el paso 5 con la imagen </w:t>
+      </w:r>
+      <w:r>
+        <w:rPr>
+          <w:rFonts w:ascii="Consolas" w:hAnsi="Consolas"/>
+          <w:color w:val="002E45"/>
+          <w:sz w:val="19"/>
+        </w:rPr>
+        <w:t>vicmar-sqlserver-respaldo:AAAA-MM-DD</w:t>
+      </w:r>
+      <w:r>
+        <w:rPr/>
+        <w:t xml:space="preserve">. El </w:t>
+      </w:r>
+      <w:r>
+        <w:rPr>
+          <w:rFonts w:ascii="Consolas" w:hAnsi="Consolas"/>
+          <w:color w:val="002E45"/>
+          <w:sz w:val="19"/>
+        </w:rPr>
+        <w:t>.env</w:t>
+      </w:r>
+      <w:r>
+        <w:rPr/>
+        <w:t xml:space="preserve"> debe conservar las contraseñas del contenedor original. Copie también </w:t>
+      </w:r>
+      <w:r>
+        <w:rPr>
+          <w:rFonts w:ascii="Consolas" w:hAnsi="Consolas"/>
+          <w:color w:val="002E45"/>
+          <w:sz w:val="19"/>
+        </w:rPr>
+        <w:t>backend\datos_locales\</w:t>
+      </w:r>
+      <w:r>
+        <w:rPr/>
+        <w:t xml:space="preserve"> (cuentas de usuario) y </w:t>
+      </w:r>
+      <w:r>
+        <w:rPr>
+          <w:rFonts w:ascii="Consolas" w:hAnsi="Consolas"/>
+          <w:color w:val="002E45"/>
+          <w:sz w:val="19"/>
+        </w:rPr>
+        <w:t>backend\ml\modelos\</w:t>
+      </w:r>
+      <w:r>
+        <w:rPr/>
+        <w:t xml:space="preserve"> (modelos entrenados).</w:t>
       </w:r>
     </w:p>
     <w:p>
@@ -4449,7 +4749,7 @@
         <w:pStyle w:val="Heading2"/>
       </w:pPr>
       <w:r>
-        <w:t>11. Solución de problemas</w:t>
+        <w:t>12. Solución de problemas</w:t>
       </w:r>
     </w:p>
     <w:tbl>
@@ -4550,12 +4850,6 @@
             <w:r/>
             <w:r>
               <w:rPr>
-                <w:sz w:val="19"/>
-              </w:rPr>
-              <w:t xml:space="preserve">Error de </w:t>
-            </w:r>
-            <w:r>
-              <w:rPr>
                 <w:rFonts w:ascii="Consolas" w:hAnsi="Consolas"/>
                 <w:color w:val="002E45"/>
                 <w:sz w:val="19"/>
@@ -4566,7 +4860,7 @@
               <w:rPr>
                 <w:sz w:val="19"/>
               </w:rPr>
-              <w:t xml:space="preserve"> u «ODBC Driver» al iniciar el backend</w:t>
+              <w:t xml:space="preserve"> no encuentra «ODBC Driver 18»</w:t>
             </w:r>
           </w:p>
         </w:tc>
@@ -4583,7 +4877,7 @@
               <w:rPr>
                 <w:sz w:val="19"/>
               </w:rPr>
-              <w:t>Falta el ODBC Driver 18</w:t>
+              <w:t>Falta el controlador</w:t>
             </w:r>
           </w:p>
         </w:tc>
@@ -4600,7 +4894,7 @@
               <w:rPr>
                 <w:sz w:val="19"/>
               </w:rPr>
-              <w:t>Instalarlo (requisito 4) y abrir una terminal nueva</w:t>
+              <w:t>Instalarlo (requisito 4) y abrir una consola nueva</w:t>
             </w:r>
           </w:p>
         </w:tc>
@@ -4620,7 +4914,7 @@
               <w:rPr>
                 <w:sz w:val="19"/>
               </w:rPr>
-              <w:t>«Conexión rechazada» o «Tiempo de espera agotado» al conectar</w:t>
+              <w:t>El pipeline se queda en «Esperando a que SQL Server acepte conexiones»</w:t>
             </w:r>
           </w:p>
         </w:tc>
@@ -4638,7 +4932,21 @@
               <w:rPr>
                 <w:sz w:val="19"/>
               </w:rPr>
-              <w:t>El contenedor está apagado o la contraseña no coincide</w:t>
+              <w:t xml:space="preserve">Contenedor apagado o </w:t>
+            </w:r>
+            <w:r>
+              <w:rPr>
+                <w:rFonts w:ascii="Consolas" w:hAnsi="Consolas"/>
+                <w:color w:val="002E45"/>
+                <w:sz w:val="19"/>
+              </w:rPr>
+              <w:t>DB_HOST</w:t>
+            </w:r>
+            <w:r>
+              <w:rPr>
+                <w:sz w:val="19"/>
+              </w:rPr>
+              <w:t xml:space="preserve"> con otro puerto</w:t>
             </w:r>
           </w:p>
         </w:tc>
@@ -4686,13 +4994,13 @@
                 <w:color w:val="002E45"/>
                 <w:sz w:val="19"/>
               </w:rPr>
-              <w:t>DB_PASSWORD</w:t>
-            </w:r>
-            <w:r>
-              <w:rPr>
-                <w:sz w:val="19"/>
-              </w:rPr>
-              <w:t xml:space="preserve"> en </w:t>
+              <w:t>DB_HOST</w:t>
+            </w:r>
+            <w:r>
+              <w:rPr>
+                <w:sz w:val="19"/>
+              </w:rPr>
+              <w:t xml:space="preserve"> y </w:t>
             </w:r>
             <w:r>
               <w:rPr>
@@ -4700,7 +5008,7 @@
                 <w:color w:val="002E45"/>
                 <w:sz w:val="19"/>
               </w:rPr>
-              <w:t>.env</w:t>
+              <w:t>DB_PASSWORD</w:t>
             </w:r>
           </w:p>
         </w:tc>
@@ -4767,7 +5075,7 @@
               <w:rPr>
                 <w:sz w:val="19"/>
               </w:rPr>
-              <w:t>Volver a crearlo con una contraseña más fuerte</w:t>
+              <w:t>Crearlo de nuevo con una contraseña más fuerte</w:t>
             </w:r>
           </w:p>
         </w:tc>
@@ -4787,29 +5095,7 @@
               <w:rPr>
                 <w:sz w:val="19"/>
               </w:rPr>
-              <w:t xml:space="preserve">Docker Desktop no arranca y habla de </w:t>
-            </w:r>
-            <w:r>
-              <w:rPr>
-                <w:rFonts w:ascii="Consolas" w:hAnsi="Consolas"/>
-                <w:color w:val="002E45"/>
-                <w:sz w:val="19"/>
-              </w:rPr>
-              <w:t>dockerInference</w:t>
-            </w:r>
-            <w:r>
-              <w:rPr>
-                <w:sz w:val="19"/>
-              </w:rPr>
-              <w:t xml:space="preserve"> o </w:t>
-            </w:r>
-            <w:r>
-              <w:rPr>
-                <w:rFonts w:ascii="Consolas" w:hAnsi="Consolas"/>
-                <w:color w:val="002E45"/>
-                <w:sz w:val="19"/>
-              </w:rPr>
-              <w:t>engine.sock</w:t>
+              <w:t>Docker Desktop no arranca por un socket dañado</w:t>
             </w:r>
           </w:p>
         </w:tc>
@@ -4827,7 +5113,7 @@
               <w:rPr>
                 <w:sz w:val="19"/>
               </w:rPr>
-              <w:t>Archivos de comunicación dañados tras un apagado brusco</w:t>
+              <w:t>Apagado brusco</w:t>
             </w:r>
           </w:p>
         </w:tc>
@@ -4858,7 +5144,7 @@
               <w:rPr>
                 <w:sz w:val="19"/>
               </w:rPr>
-              <w:t xml:space="preserve"> (no borrar) las carpetas </w:t>
+              <w:t xml:space="preserve"> </w:t>
             </w:r>
             <w:r>
               <w:rPr>
@@ -4872,21 +5158,7 @@
               <w:rPr>
                 <w:sz w:val="19"/>
               </w:rPr>
-              <w:t xml:space="preserve"> y </w:t>
-            </w:r>
-            <w:r>
-              <w:rPr>
-                <w:rFonts w:ascii="Consolas" w:hAnsi="Consolas"/>
-                <w:color w:val="002E45"/>
-                <w:sz w:val="19"/>
-              </w:rPr>
-              <w:t>%LOCALAPPDATA%\docker-secrets-engine</w:t>
-            </w:r>
-            <w:r>
-              <w:rPr>
-                <w:sz w:val="19"/>
-              </w:rPr>
-              <w:t xml:space="preserve">; volver a abrirlo. </w:t>
+              <w:t xml:space="preserve">. </w:t>
             </w:r>
             <w:r>
               <w:rPr>
@@ -4899,7 +5171,7 @@
               <w:rPr>
                 <w:sz w:val="19"/>
               </w:rPr>
-              <w:t xml:space="preserve"> usar «Reset to factory defaults»: borra el contenedor con todas las bases</w:t>
+              <w:t xml:space="preserve"> usar «Reset to factory defaults»: borra el contenedor y sus bases</w:t>
             </w:r>
           </w:p>
         </w:tc>
@@ -4926,7 +5198,21 @@
                 <w:color w:val="002E45"/>
                 <w:sz w:val="19"/>
               </w:rPr>
-              <w:t>8080</w:t>
+              <w:t>3000</w:t>
+            </w:r>
+            <w:r>
+              <w:rPr>
+                <w:sz w:val="19"/>
+              </w:rPr>
+              <w:t xml:space="preserve"> u </w:t>
+            </w:r>
+            <w:r>
+              <w:rPr>
+                <w:rFonts w:ascii="Consolas" w:hAnsi="Consolas"/>
+                <w:color w:val="002E45"/>
+                <w:sz w:val="19"/>
+              </w:rPr>
+              <w:t>8090</w:t>
             </w:r>
             <w:r>
               <w:rPr>
@@ -4966,7 +5252,7 @@
               <w:rPr>
                 <w:sz w:val="19"/>
               </w:rPr>
-              <w:t xml:space="preserve">Este sistema usa el </w:t>
+              <w:t xml:space="preserve">Cambiar </w:t>
             </w:r>
             <w:r>
               <w:rPr>
@@ -4974,13 +5260,49 @@
                 <w:color w:val="002E45"/>
                 <w:sz w:val="19"/>
               </w:rPr>
-              <w:t>8090</w:t>
-            </w:r>
-            <w:r>
-              <w:rPr>
-                <w:sz w:val="19"/>
-              </w:rPr>
-              <w:t xml:space="preserve"> para el backend; no cambie ese valor salvo que también esté ocupado</w:t>
+              <w:t>port</w:t>
+            </w:r>
+            <w:r>
+              <w:rPr>
+                <w:sz w:val="19"/>
+              </w:rPr>
+              <w:t xml:space="preserve"> en </w:t>
+            </w:r>
+            <w:r>
+              <w:rPr>
+                <w:rFonts w:ascii="Consolas" w:hAnsi="Consolas"/>
+                <w:color w:val="002E45"/>
+                <w:sz w:val="19"/>
+              </w:rPr>
+              <w:t>vite.config.ts</w:t>
+            </w:r>
+            <w:r>
+              <w:rPr>
+                <w:sz w:val="19"/>
+              </w:rPr>
+              <w:t xml:space="preserve"> o el </w:t>
+            </w:r>
+            <w:r>
+              <w:rPr>
+                <w:rFonts w:ascii="Consolas" w:hAnsi="Consolas"/>
+                <w:color w:val="002E45"/>
+                <w:sz w:val="19"/>
+              </w:rPr>
+              <w:t>--port</w:t>
+            </w:r>
+            <w:r>
+              <w:rPr>
+                <w:sz w:val="19"/>
+              </w:rPr>
+              <w:t xml:space="preserve"> de la API junto con </w:t>
+            </w:r>
+            <w:r>
+              <w:rPr>
+                <w:rFonts w:ascii="Consolas" w:hAnsi="Consolas"/>
+                <w:color w:val="002E45"/>
+                <w:sz w:val="19"/>
+              </w:rPr>
+              <w:t>VITE_BACKEND_URL</w:t>
             </w:r>
           </w:p>
         </w:tc>
@@ -5000,7 +5322,7 @@
               <w:rPr>
                 <w:sz w:val="19"/>
               </w:rPr>
-              <w:t xml:space="preserve">Puerto </w:t>
+              <w:t xml:space="preserve">El pipeline se detiene en </w:t>
             </w:r>
             <w:r>
               <w:rPr>
@@ -5008,41 +5330,7 @@
                 <w:color w:val="002E45"/>
                 <w:sz w:val="19"/>
               </w:rPr>
-              <w:t>1433</w:t>
-            </w:r>
-            <w:r>
-              <w:rPr>
-                <w:sz w:val="19"/>
-              </w:rPr>
-              <w:t xml:space="preserve">, </w:t>
-            </w:r>
-            <w:r>
-              <w:rPr>
-                <w:rFonts w:ascii="Consolas" w:hAnsi="Consolas"/>
-                <w:color w:val="002E45"/>
-                <w:sz w:val="19"/>
-              </w:rPr>
-              <w:t>3000</w:t>
-            </w:r>
-            <w:r>
-              <w:rPr>
-                <w:sz w:val="19"/>
-              </w:rPr>
-              <w:t xml:space="preserve"> u </w:t>
-            </w:r>
-            <w:r>
-              <w:rPr>
-                <w:rFonts w:ascii="Consolas" w:hAnsi="Consolas"/>
-                <w:color w:val="002E45"/>
-                <w:sz w:val="19"/>
-              </w:rPr>
-              <w:t>8090</w:t>
-            </w:r>
-            <w:r>
-              <w:rPr>
-                <w:sz w:val="19"/>
-              </w:rPr>
-              <w:t xml:space="preserve"> ocupado</w:t>
+              <w:t>oulad</w:t>
             </w:r>
           </w:p>
         </w:tc>
@@ -5060,7 +5348,7 @@
               <w:rPr>
                 <w:sz w:val="19"/>
               </w:rPr>
-              <w:t>Otro programa usa el puerto</w:t>
+              <w:t>Faltan los CSV</w:t>
             </w:r>
           </w:p>
         </w:tc>
@@ -5078,7 +5366,7 @@
               <w:rPr>
                 <w:sz w:val="19"/>
               </w:rPr>
-              <w:t>Cambiar el mapeo de Docker (</w:t>
+              <w:t xml:space="preserve">Descargarlos (ver </w:t>
             </w:r>
             <w:r>
               <w:rPr>
@@ -5086,13 +5374,13 @@
                 <w:color w:val="002E45"/>
                 <w:sz w:val="19"/>
               </w:rPr>
-              <w:t>-p 14330:1433</w:t>
-            </w:r>
-            <w:r>
-              <w:rPr>
-                <w:sz w:val="19"/>
-              </w:rPr>
-              <w:t xml:space="preserve"> y </w:t>
+              <w:t>datos/README.md</w:t>
+            </w:r>
+            <w:r>
+              <w:rPr>
+                <w:sz w:val="19"/>
+              </w:rPr>
+              <w:t xml:space="preserve">) o usar </w:t>
             </w:r>
             <w:r>
               <w:rPr>
@@ -5100,63 +5388,7 @@
                 <w:color w:val="002E45"/>
                 <w:sz w:val="19"/>
               </w:rPr>
-              <w:t>DB_HOST=localhost,14330</w:t>
-            </w:r>
-            <w:r>
-              <w:rPr>
-                <w:sz w:val="19"/>
-              </w:rPr>
-              <w:t xml:space="preserve">), el puerto de </w:t>
-            </w:r>
-            <w:r>
-              <w:rPr>
-                <w:rFonts w:ascii="Consolas" w:hAnsi="Consolas"/>
-                <w:color w:val="002E45"/>
-                <w:sz w:val="19"/>
-              </w:rPr>
-              <w:t>vite.config.ts</w:t>
-            </w:r>
-            <w:r>
-              <w:rPr>
-                <w:sz w:val="19"/>
-              </w:rPr>
-              <w:t xml:space="preserve"> o el </w:t>
-            </w:r>
-            <w:r>
-              <w:rPr>
-                <w:rFonts w:ascii="Consolas" w:hAnsi="Consolas"/>
-                <w:color w:val="002E45"/>
-                <w:sz w:val="19"/>
-              </w:rPr>
-              <w:t>--port</w:t>
-            </w:r>
-            <w:r>
-              <w:rPr>
-                <w:sz w:val="19"/>
-              </w:rPr>
-              <w:t xml:space="preserve"> de </w:t>
-            </w:r>
-            <w:r>
-              <w:rPr>
-                <w:rFonts w:ascii="Consolas" w:hAnsi="Consolas"/>
-                <w:color w:val="002E45"/>
-                <w:sz w:val="19"/>
-              </w:rPr>
-              <w:t>dev:backend</w:t>
-            </w:r>
-            <w:r>
-              <w:rPr>
-                <w:sz w:val="19"/>
-              </w:rPr>
-              <w:t xml:space="preserve"> junto con </w:t>
-            </w:r>
-            <w:r>
-              <w:rPr>
-                <w:rFonts w:ascii="Consolas" w:hAnsi="Consolas"/>
-                <w:color w:val="002E45"/>
-                <w:sz w:val="19"/>
-              </w:rPr>
-              <w:t>VITE_BACKEND_URL</w:t>
+              <w:t>--sin-oulad</w:t>
             </w:r>
           </w:p>
         </w:tc>
@@ -5175,7 +5407,7 @@
               <w:rPr>
                 <w:sz w:val="19"/>
               </w:rPr>
-              <w:t>El chat responde con un aviso de que ningún proveedor de IA está disponible</w:t>
+              <w:t>La consulta dice que ningún proveedor de IA está disponible</w:t>
             </w:r>
           </w:p>
         </w:tc>
@@ -5209,7 +5441,7 @@
               <w:rPr>
                 <w:sz w:val="19"/>
               </w:rPr>
-              <w:t xml:space="preserve">Agregar otra clave gratuita en </w:t>
+              <w:t xml:space="preserve">Agregar otra clave en el </w:t>
             </w:r>
             <w:r>
               <w:rPr>
@@ -5223,7 +5455,7 @@
               <w:rPr>
                 <w:sz w:val="19"/>
               </w:rPr>
-              <w:t xml:space="preserve"> o esperar a que se renueve la cuota del día</w:t>
+              <w:t>; las métricas certificadas siguen respondiendo</w:t>
             </w:r>
           </w:p>
         </w:tc>
@@ -5243,7 +5475,7 @@
               <w:rPr>
                 <w:sz w:val="19"/>
               </w:rPr>
-              <w:t>El panel de riesgo no aparece</w:t>
+              <w:t>El panel dice «Todavía no hay estudiantes calificados»</w:t>
             </w:r>
           </w:p>
         </w:tc>
@@ -5261,7 +5493,29 @@
               <w:rPr>
                 <w:sz w:val="19"/>
               </w:rPr>
-              <w:t>El usuario no tiene el rol ACADÉMICO o ADMINISTRADOR</w:t>
+              <w:t xml:space="preserve">No se ejecutaron </w:t>
+            </w:r>
+            <w:r>
+              <w:rPr>
+                <w:rFonts w:ascii="Consolas" w:hAnsi="Consolas"/>
+                <w:color w:val="002E45"/>
+                <w:sz w:val="19"/>
+              </w:rPr>
+              <w:t>entrenar</w:t>
+            </w:r>
+            <w:r>
+              <w:rPr>
+                <w:sz w:val="19"/>
+              </w:rPr>
+              <w:t xml:space="preserve"> y </w:t>
+            </w:r>
+            <w:r>
+              <w:rPr>
+                <w:rFonts w:ascii="Consolas" w:hAnsi="Consolas"/>
+                <w:color w:val="002E45"/>
+                <w:sz w:val="19"/>
+              </w:rPr>
+              <w:t>calificar</w:t>
             </w:r>
           </w:p>
         </w:tc>
@@ -5277,23 +5531,11 @@
             <w:r/>
             <w:r>
               <w:rPr>
-                <w:sz w:val="19"/>
-              </w:rPr>
-              <w:t xml:space="preserve">Entrar con </w:t>
-            </w:r>
-            <w:r>
-              <w:rPr>
                 <w:rFonts w:ascii="Consolas" w:hAnsi="Consolas"/>
                 <w:color w:val="002E45"/>
                 <w:sz w:val="19"/>
               </w:rPr>
-              <w:t>acad</w:t>
-            </w:r>
-            <w:r>
-              <w:rPr>
-                <w:sz w:val="19"/>
-              </w:rPr>
-              <w:t xml:space="preserve"> o con un administrador</w:t>
+              <w:t>reconstruir_sistema.bat --desde entrenar</w:t>
             </w:r>
           </w:p>
         </w:tc>
@@ -5316,12 +5558,6 @@
               </w:rPr>
               <w:t>ModuleNotFoundError</w:t>
             </w:r>
-            <w:r>
-              <w:rPr>
-                <w:sz w:val="19"/>
-              </w:rPr>
-              <w:t xml:space="preserve"> al ejecutar un script</w:t>
-            </w:r>
           </w:p>
         </w:tc>
         <w:tc>
@@ -5362,85 +5598,7 @@
                 <w:color w:val="002E45"/>
                 <w:sz w:val="19"/>
               </w:rPr>
-              <w:t>codigo_fuente\backend\venv\Scripts\python.exe</w:t>
-            </w:r>
-          </w:p>
-        </w:tc>
-      </w:tr>
-      <w:tr>
-        <w:tc>
-          <w:tcPr>
-            <w:tcW w:type="dxa" w:w="3135"/>
-            <w:shd w:val="clear" w:color="auto" w:fill="F2F6F9"/>
-          </w:tcPr>
-          <w:p>
-            <w:pPr>
-              <w:spacing w:after="0"/>
-            </w:pPr>
-            <w:r/>
-            <w:r>
-              <w:rPr>
-                <w:sz w:val="19"/>
-              </w:rPr>
-              <w:t>El pipeline se detiene en OULAD</w:t>
-            </w:r>
-          </w:p>
-        </w:tc>
-        <w:tc>
-          <w:tcPr>
-            <w:tcW w:type="dxa" w:w="3135"/>
-            <w:shd w:val="clear" w:color="auto" w:fill="F2F6F9"/>
-          </w:tcPr>
-          <w:p>
-            <w:pPr>
-              <w:spacing w:after="0"/>
-            </w:pPr>
-            <w:r/>
-            <w:r>
-              <w:rPr>
-                <w:sz w:val="19"/>
-              </w:rPr>
-              <w:t xml:space="preserve">Faltan los CSV en </w:t>
-            </w:r>
-            <w:r>
-              <w:rPr>
-                <w:rFonts w:ascii="Consolas" w:hAnsi="Consolas"/>
-                <w:color w:val="002E45"/>
-                <w:sz w:val="19"/>
-              </w:rPr>
-              <w:t>datos\externos\oulad\</w:t>
-            </w:r>
-          </w:p>
-        </w:tc>
-        <w:tc>
-          <w:tcPr>
-            <w:tcW w:type="dxa" w:w="3135"/>
-            <w:shd w:val="clear" w:color="auto" w:fill="F2F6F9"/>
-          </w:tcPr>
-          <w:p>
-            <w:pPr>
-              <w:spacing w:after="0"/>
-            </w:pPr>
-            <w:r/>
-            <w:r>
-              <w:rPr>
-                <w:sz w:val="19"/>
-              </w:rPr>
-              <w:t xml:space="preserve">Descargarlos (ver </w:t>
-            </w:r>
-            <w:r>
-              <w:rPr>
-                <w:rFonts w:ascii="Consolas" w:hAnsi="Consolas"/>
-                <w:color w:val="002E45"/>
-                <w:sz w:val="19"/>
-              </w:rPr>
-              <w:t>datos/README.md</w:t>
-            </w:r>
-            <w:r>
-              <w:rPr>
-                <w:sz w:val="19"/>
-              </w:rPr>
-              <w:t>)</w:t>
+              <w:t>codigo_fuente\backend\venv\Scripts\python</w:t>
             </w:r>
           </w:p>
         </w:tc>
@@ -5456,7 +5614,7 @@
         <w:pStyle w:val="Heading2"/>
       </w:pPr>
       <w:r>
-        <w:t>12. Seguridad y privacidad</w:t>
+        <w:t>13. Seguridad y privacidad (LOPDP)</w:t>
       </w:r>
     </w:p>
     <w:p>
@@ -5483,18 +5641,6 @@
       </w:r>
       <w:r>
         <w:rPr/>
-        <w:t xml:space="preserve">, </w:t>
-      </w:r>
-      <w:r>
-        <w:rPr>
-          <w:rFonts w:ascii="Consolas" w:hAnsi="Consolas"/>
-          <w:color w:val="002E45"/>
-          <w:sz w:val="19"/>
-        </w:rPr>
-        <w:t>security_config.json</w:t>
-      </w:r>
-      <w:r>
-        <w:rPr/>
         <w:t xml:space="preserve"> y </w:t>
       </w:r>
       <w:r>
@@ -5503,11 +5649,11 @@
           <w:color w:val="002E45"/>
           <w:sz w:val="19"/>
         </w:rPr>
-        <w:t>usuarios_prueba.local.json</w:t>
+        <w:t>datos_locales\</w:t>
       </w:r>
       <w:r>
         <w:rPr/>
-        <w:t xml:space="preserve"> nunca se suben al repositorio. Cambie las contraseñas de </w:t>
+        <w:t xml:space="preserve"> nunca se versionan. Cambie las contraseñas de </w:t>
       </w:r>
       <w:r>
         <w:rPr>
@@ -5519,7 +5665,28 @@
       </w:r>
       <w:r>
         <w:rPr/>
-        <w:t xml:space="preserve">, </w:t>
+        <w:t xml:space="preserve"> y de las cuentas de</w:t>
+      </w:r>
+    </w:p>
+    <w:p>
+      <w:r>
+        <w:rPr/>
+        <w:t>demostración antes de usar datos reales.</w:t>
+      </w:r>
+    </w:p>
+    <w:p>
+      <w:pPr>
+        <w:pStyle w:val="ListBullet"/>
+      </w:pPr>
+      <w:r>
+        <w:rPr>
+          <w:b/>
+        </w:rPr>
+        <w:t>Mínimo privilegio:</w:t>
+      </w:r>
+      <w:r>
+        <w:rPr/>
+        <w:t xml:space="preserve"> la API lee con </w:t>
       </w:r>
       <w:r>
         <w:rPr>
@@ -5531,7 +5698,33 @@
       </w:r>
       <w:r>
         <w:rPr/>
-        <w:t xml:space="preserve"> y de los usuarios antes de usar el sistema con datos reales.</w:t>
+        <w:t xml:space="preserve"> (solo vistas) y escribe el seguimiento con </w:t>
+      </w:r>
+      <w:r>
+        <w:rPr>
+          <w:rFonts w:ascii="Consolas" w:hAnsi="Consolas"/>
+          <w:color w:val="002E45"/>
+          <w:sz w:val="19"/>
+        </w:rPr>
+        <w:t>app_seguimiento</w:t>
+      </w:r>
+    </w:p>
+    <w:p>
+      <w:r>
+        <w:rPr/>
+        <w:t xml:space="preserve">(solo dos procedimientos). Cada vista filtra por la institución fijada en </w:t>
+      </w:r>
+      <w:r>
+        <w:rPr>
+          <w:rFonts w:ascii="Consolas" w:hAnsi="Consolas"/>
+          <w:color w:val="002E45"/>
+          <w:sz w:val="19"/>
+        </w:rPr>
+        <w:t>SESSION_CONTEXT</w:t>
+      </w:r>
+      <w:r>
+        <w:rPr/>
+        <w:t xml:space="preserve"> al abrir la conexión; sin institución no devuelve filas.</w:t>
       </w:r>
     </w:p>
     <w:p>
@@ -5542,11 +5735,17 @@
         <w:rPr>
           <w:b/>
         </w:rPr>
-        <w:t>Solo lectura para la IA:</w:t>
+        <w:t>Consulta conversacional:</w:t>
       </w:r>
       <w:r>
         <w:rPr/>
-        <w:t xml:space="preserve"> el SQL que genera la IA se ejecuta con </w:t>
+        <w:t xml:space="preserve"> el SQL generado por la IA se valida sobre su árbol sintáctico (una sola sentencia</w:t>
+      </w:r>
+    </w:p>
+    <w:p>
+      <w:r>
+        <w:rPr/>
+        <w:t xml:space="preserve">de lectura y solo sobre vistas autorizadas) antes de ejecutarse con </w:t>
       </w:r>
       <w:r>
         <w:rPr>
@@ -5558,19 +5757,17 @@
       </w:r>
       <w:r>
         <w:rPr/>
-        <w:t xml:space="preserve">, que solo puede leer las vistas </w:t>
+        <w:t xml:space="preserve">. A los proveedores se envían la pregunta, el esquema de las vistas y ejemplos; filas, y solo seudonimizadas, únicamente si la persona pide </w:t>
       </w:r>
       <w:r>
         <w:rPr>
-          <w:rFonts w:ascii="Consolas" w:hAnsi="Consolas"/>
-          <w:color w:val="002E45"/>
-          <w:sz w:val="19"/>
+          <w:b/>
         </w:rPr>
-        <w:t>VIS_*</w:t>
+        <w:t>Interpretar con IA</w:t>
       </w:r>
       <w:r>
         <w:rPr/>
-        <w:t>. Cada vista se filtra por la institución de la sesión; sin institución no devuelve nada.</w:t>
+        <w:t>.</w:t>
       </w:r>
     </w:p>
     <w:p>
@@ -5597,7 +5794,25 @@
       </w:r>
       <w:r>
         <w:rPr/>
-        <w:t xml:space="preserve"> es sintético y anonimizado (nombres ficticios; cédulas con el código de provincia «00», que el Registro Civil no asigna). OULAD es público y anónimo (CC BY 4.0).</w:t>
+        <w:t xml:space="preserve"> es sintético (cédulas con código de provincia </w:t>
+      </w:r>
+      <w:r>
+        <w:rPr>
+          <w:rFonts w:ascii="Consolas" w:hAnsi="Consolas"/>
+          <w:color w:val="002E45"/>
+          <w:sz w:val="19"/>
+        </w:rPr>
+        <w:t>00</w:t>
+      </w:r>
+      <w:r>
+        <w:rPr/>
+        <w:t>, que el Registro Civil no</w:t>
+      </w:r>
+    </w:p>
+    <w:p>
+      <w:r>
+        <w:rPr/>
+        <w:t>asigna). OULAD es público y anónimo (CC BY 4.0) y no se redistribuye.</w:t>
       </w:r>
     </w:p>
     <w:p>
@@ -5608,26 +5823,17 @@
         <w:rPr>
           <w:b/>
         </w:rPr>
-        <w:t>Datos personales:</w:t>
+        <w:t>Sesiones y accesos:</w:t>
       </w:r>
       <w:r>
         <w:rPr/>
-        <w:t xml:space="preserve"> antes de enviar resultados a un proveedor externo de IA, el sistema reemplaza cédulas y nombres por seudónimos; en pantalla la cédula siempre aparece enmascarada.</w:t>
+        <w:t xml:space="preserve"> JWT con vencimiento de 8 horas; 5 intentos fallidos bloquean 5 minutos; cada ingreso,</w:t>
       </w:r>
     </w:p>
     <w:p>
-      <w:pPr>
-        <w:pStyle w:val="ListBullet"/>
-      </w:pPr>
-      <w:r>
-        <w:rPr>
-          <w:b/>
-        </w:rPr>
-        <w:t>Sesiones:</w:t>
-      </w:r>
       <w:r>
         <w:rPr/>
-        <w:t xml:space="preserve"> se cierran solas tras 30 minutos sin actividad.</w:t>
+        <w:t>ficha, consulta y exportación queda en la auditoría.</w:t>
       </w:r>
     </w:p>
     <w:p>
@@ -5635,26 +5841,7 @@
         <w:pStyle w:val="Heading2"/>
       </w:pPr>
       <w:r>
-        <w:t>13. Referencia rápida</w:t>
-      </w:r>
-    </w:p>
-    <w:p>
-      <w:pPr>
-        <w:shd w:val="clear" w:color="auto" w:fill="F2F4F6"/>
-        <w:ind w:left="170"/>
-      </w:pPr>
-      <w:r>
-        <w:rPr>
-          <w:rFonts w:ascii="Consolas" w:hAnsi="Consolas"/>
-          <w:sz w:val="17"/>
-        </w:rPr>
-        <w:t>docker start vicmar-sqlserver                      # encender la base de datos</w:t>
-        <w:br/>
-        <w:t>cd codigo_fuente\frontend; npm run dev:backend     # backend (terminal 1)</w:t>
-        <w:br/>
-        <w:t>cd codigo_fuente\frontend; npm run dev             # frontend (terminal 2)</w:t>
-        <w:br/>
-        <w:t>docker stop vicmar-sqlserver                       # apagar la base de datos</w:t>
+        <w:t>14. Referencia rápida</w:t>
       </w:r>
     </w:p>
     <w:tbl>
@@ -5689,7 +5876,7 @@
                 <w:color w:val="FFFFFF"/>
                 <w:sz w:val="19"/>
               </w:rPr>
-              <w:t>Servicio</w:t>
+              <w:t>Acción</w:t>
             </w:r>
           </w:p>
         </w:tc>
@@ -5713,7 +5900,7 @@
                 <w:color w:val="FFFFFF"/>
                 <w:sz w:val="19"/>
               </w:rPr>
-              <w:t>Dirección</w:t>
+              <w:t>Comando</w:t>
             </w:r>
           </w:p>
         </w:tc>
@@ -5732,7 +5919,7 @@
               <w:rPr>
                 <w:sz w:val="19"/>
               </w:rPr>
-              <w:t>Aplicación</w:t>
+              <w:t>Reconstruir todo</w:t>
             </w:r>
           </w:p>
         </w:tc>
@@ -5747,9 +5934,11 @@
             <w:r/>
             <w:r>
               <w:rPr>
-                <w:sz w:val="19"/>
-              </w:rPr>
-              <w:t>http://localhost:3000</w:t>
+                <w:rFonts w:ascii="Consolas" w:hAnsi="Consolas"/>
+                <w:color w:val="002E45"/>
+                <w:sz w:val="19"/>
+              </w:rPr>
+              <w:t>codigo_fuente\scripts\reconstruir_sistema.bat</w:t>
             </w:r>
           </w:p>
         </w:tc>
@@ -5769,7 +5958,7 @@
               <w:rPr>
                 <w:sz w:val="19"/>
               </w:rPr>
-              <w:t>Salud del backend</w:t>
+              <w:t>Retomar desde un paso</w:t>
             </w:r>
           </w:p>
         </w:tc>
@@ -5785,9 +5974,11 @@
             <w:r/>
             <w:r>
               <w:rPr>
-                <w:sz w:val="19"/>
-              </w:rPr>
-              <w:t>http://127.0.0.1:8090/api/health</w:t>
+                <w:rFonts w:ascii="Consolas" w:hAnsi="Consolas"/>
+                <w:color w:val="002E45"/>
+                <w:sz w:val="19"/>
+              </w:rPr>
+              <w:t>codigo_fuente\scripts\reconstruir_sistema.bat --desde calificar</w:t>
             </w:r>
           </w:p>
         </w:tc>
@@ -5806,7 +5997,7 @@
               <w:rPr>
                 <w:sz w:val="19"/>
               </w:rPr>
-              <w:t>Documentación de la API</w:t>
+              <w:t>Evaluar la consulta con IA</w:t>
             </w:r>
           </w:p>
         </w:tc>
@@ -5821,9 +6012,11 @@
             <w:r/>
             <w:r>
               <w:rPr>
-                <w:sz w:val="19"/>
-              </w:rPr>
-              <w:t>http://127.0.0.1:8090/docs</w:t>
+                <w:rFonts w:ascii="Consolas" w:hAnsi="Consolas"/>
+                <w:color w:val="002E45"/>
+                <w:sz w:val="19"/>
+              </w:rPr>
+              <w:t>codigo_fuente\scripts\reconstruir_sistema.bat --solo consulta --con-consulta</w:t>
             </w:r>
           </w:p>
         </w:tc>
@@ -5843,7 +6036,7 @@
               <w:rPr>
                 <w:sz w:val="19"/>
               </w:rPr>
-              <w:t>SQL Server</w:t>
+              <w:t>Encender</w:t>
             </w:r>
           </w:p>
         </w:tc>
@@ -5863,7 +6056,230 @@
                 <w:color w:val="002E45"/>
                 <w:sz w:val="19"/>
               </w:rPr>
-              <w:t>localhost,1433</w:t>
+              <w:t>codigo_fuente\scripts\levantar_sistema.bat</w:t>
+            </w:r>
+          </w:p>
+        </w:tc>
+      </w:tr>
+    </w:tbl>
+    <w:p>
+      <w:pPr>
+        <w:spacing w:after="40"/>
+      </w:pPr>
+    </w:p>
+    <w:tbl>
+      <w:tblPr>
+        <w:tblStyle w:val="TableGrid"/>
+        <w:tblW w:type="auto" w:w="0"/>
+        <w:jc w:val="center"/>
+        <w:tblLook w:firstColumn="1" w:firstRow="1" w:lastColumn="0" w:lastRow="0" w:noHBand="0" w:noVBand="1" w:val="04A0"/>
+      </w:tblPr>
+      <w:tblGrid>
+        <w:gridCol w:w="4703"/>
+        <w:gridCol w:w="4703"/>
+      </w:tblGrid>
+      <w:tr>
+        <w:tc>
+          <w:tcPr>
+            <w:tcW w:type="dxa" w:w="4703"/>
+            <w:shd w:val="clear" w:color="auto" w:fill="002E45"/>
+          </w:tcPr>
+          <w:p>
+            <w:pPr>
+              <w:spacing w:after="0"/>
+            </w:pPr>
+            <w:r>
+              <w:rPr>
+                <w:b/>
+              </w:rPr>
+            </w:r>
+            <w:r>
+              <w:rPr>
+                <w:b/>
+                <w:color w:val="FFFFFF"/>
+                <w:sz w:val="19"/>
+              </w:rPr>
+              <w:t>Servicio</w:t>
+            </w:r>
+          </w:p>
+        </w:tc>
+        <w:tc>
+          <w:tcPr>
+            <w:tcW w:type="dxa" w:w="4703"/>
+            <w:shd w:val="clear" w:color="auto" w:fill="002E45"/>
+          </w:tcPr>
+          <w:p>
+            <w:pPr>
+              <w:spacing w:after="0"/>
+            </w:pPr>
+            <w:r>
+              <w:rPr>
+                <w:b/>
+              </w:rPr>
+            </w:r>
+            <w:r>
+              <w:rPr>
+                <w:b/>
+                <w:color w:val="FFFFFF"/>
+                <w:sz w:val="19"/>
+              </w:rPr>
+              <w:t>Dirección</w:t>
+            </w:r>
+          </w:p>
+        </w:tc>
+      </w:tr>
+      <w:tr>
+        <w:tc>
+          <w:tcPr>
+            <w:tcW w:type="dxa" w:w="4703"/>
+          </w:tcPr>
+          <w:p>
+            <w:pPr>
+              <w:spacing w:after="0"/>
+            </w:pPr>
+            <w:r/>
+            <w:r>
+              <w:rPr>
+                <w:sz w:val="19"/>
+              </w:rPr>
+              <w:t>Aplicación</w:t>
+            </w:r>
+          </w:p>
+        </w:tc>
+        <w:tc>
+          <w:tcPr>
+            <w:tcW w:type="dxa" w:w="4703"/>
+          </w:tcPr>
+          <w:p>
+            <w:pPr>
+              <w:spacing w:after="0"/>
+            </w:pPr>
+            <w:r/>
+            <w:r>
+              <w:rPr>
+                <w:sz w:val="19"/>
+              </w:rPr>
+              <w:t>http://localhost:3000</w:t>
+            </w:r>
+          </w:p>
+        </w:tc>
+      </w:tr>
+      <w:tr>
+        <w:tc>
+          <w:tcPr>
+            <w:tcW w:type="dxa" w:w="4703"/>
+            <w:shd w:val="clear" w:color="auto" w:fill="F2F6F9"/>
+          </w:tcPr>
+          <w:p>
+            <w:pPr>
+              <w:spacing w:after="0"/>
+            </w:pPr>
+            <w:r/>
+            <w:r>
+              <w:rPr>
+                <w:sz w:val="19"/>
+              </w:rPr>
+              <w:t>Salud de la API</w:t>
+            </w:r>
+          </w:p>
+        </w:tc>
+        <w:tc>
+          <w:tcPr>
+            <w:tcW w:type="dxa" w:w="4703"/>
+            <w:shd w:val="clear" w:color="auto" w:fill="F2F6F9"/>
+          </w:tcPr>
+          <w:p>
+            <w:pPr>
+              <w:spacing w:after="0"/>
+            </w:pPr>
+            <w:r/>
+            <w:r>
+              <w:rPr>
+                <w:sz w:val="19"/>
+              </w:rPr>
+              <w:t>http://127.0.0.1:8090/api/salud</w:t>
+            </w:r>
+          </w:p>
+        </w:tc>
+      </w:tr>
+      <w:tr>
+        <w:tc>
+          <w:tcPr>
+            <w:tcW w:type="dxa" w:w="4703"/>
+          </w:tcPr>
+          <w:p>
+            <w:pPr>
+              <w:spacing w:after="0"/>
+            </w:pPr>
+            <w:r/>
+            <w:r>
+              <w:rPr>
+                <w:sz w:val="19"/>
+              </w:rPr>
+              <w:t>Documentación de la API</w:t>
+            </w:r>
+          </w:p>
+        </w:tc>
+        <w:tc>
+          <w:tcPr>
+            <w:tcW w:type="dxa" w:w="4703"/>
+          </w:tcPr>
+          <w:p>
+            <w:pPr>
+              <w:spacing w:after="0"/>
+            </w:pPr>
+            <w:r/>
+            <w:r>
+              <w:rPr>
+                <w:sz w:val="19"/>
+              </w:rPr>
+              <w:t>http://127.0.0.1:8090/docs</w:t>
+            </w:r>
+          </w:p>
+        </w:tc>
+      </w:tr>
+      <w:tr>
+        <w:tc>
+          <w:tcPr>
+            <w:tcW w:type="dxa" w:w="4703"/>
+            <w:shd w:val="clear" w:color="auto" w:fill="F2F6F9"/>
+          </w:tcPr>
+          <w:p>
+            <w:pPr>
+              <w:spacing w:after="0"/>
+            </w:pPr>
+            <w:r/>
+            <w:r>
+              <w:rPr>
+                <w:sz w:val="19"/>
+              </w:rPr>
+              <w:t>SQL Server</w:t>
+            </w:r>
+          </w:p>
+        </w:tc>
+        <w:tc>
+          <w:tcPr>
+            <w:tcW w:type="dxa" w:w="4703"/>
+            <w:shd w:val="clear" w:color="auto" w:fill="F2F6F9"/>
+          </w:tcPr>
+          <w:p>
+            <w:pPr>
+              <w:spacing w:after="0"/>
+            </w:pPr>
+            <w:r/>
+            <w:r>
+              <w:rPr>
+                <w:sz w:val="19"/>
+              </w:rPr>
+              <w:t xml:space="preserve">según </w:t>
+            </w:r>
+            <w:r>
+              <w:rPr>
+                <w:rFonts w:ascii="Consolas" w:hAnsi="Consolas"/>
+                <w:color w:val="002E45"/>
+                <w:sz w:val="19"/>
+              </w:rPr>
+              <w:t>DB_HOST</w:t>
             </w:r>
           </w:p>
         </w:tc>
@@ -5929,7 +6345,7 @@
         <w:color w:val="5B7385"/>
         <w:sz w:val="17"/>
       </w:rPr>
-      <w:t>VicMar Data AI · Manual técnico de instalación</w:t>
+      <w:t>VicMar · Manual técnico de instalación</w:t>
     </w:r>
   </w:p>
 </w:hdr>

</xml_diff>